<commit_message>
Add initial Python tutorials and examples for variables, data types, and operations
</commit_message>
<xml_diff>
--- a/PythonTutorial.docx
+++ b/PythonTutorial.docx
@@ -16,7 +16,15 @@
           <w:b/>
           <w:bCs/>
         </w:rPr>
-        <w:t>Day 1:</w:t>
+        <w:t>Lecture</w:t>
+      </w:r>
+      <w:r>
+        <w:rPr>
+          <w:rFonts w:ascii="Times New Roman" w:hAnsi="Times New Roman" w:cs="Times New Roman"/>
+          <w:b/>
+          <w:bCs/>
+        </w:rPr>
+        <w:t xml:space="preserve"> 1:</w:t>
       </w:r>
     </w:p>
     <w:p>
@@ -195,21 +203,11 @@
           <w:rFonts w:ascii="Times New Roman" w:hAnsi="Times New Roman" w:cs="Times New Roman"/>
         </w:rPr>
       </w:pPr>
-      <w:proofErr w:type="spellStart"/>
-      <w:proofErr w:type="gramStart"/>
-      <w:r>
-        <w:rPr>
-          <w:rFonts w:ascii="Times New Roman" w:hAnsi="Times New Roman" w:cs="Times New Roman"/>
-        </w:rPr>
-        <w:t>isAllowed</w:t>
-      </w:r>
-      <w:proofErr w:type="spellEnd"/>
-      <w:proofErr w:type="gramEnd"/>
-      <w:r>
-        <w:rPr>
-          <w:rFonts w:ascii="Times New Roman" w:hAnsi="Times New Roman" w:cs="Times New Roman"/>
-        </w:rPr>
-        <w:t xml:space="preserve"> = True/False</w:t>
+      <w:r>
+        <w:rPr>
+          <w:rFonts w:ascii="Times New Roman" w:hAnsi="Times New Roman" w:cs="Times New Roman"/>
+        </w:rPr>
+        <w:t>isAllowed = True/False</w:t>
       </w:r>
     </w:p>
     <w:p>
@@ -261,19 +259,11 @@
           <w:rFonts w:ascii="Times New Roman" w:hAnsi="Times New Roman" w:cs="Times New Roman"/>
         </w:rPr>
       </w:pPr>
-      <w:proofErr w:type="gramStart"/>
-      <w:r>
-        <w:rPr>
-          <w:rFonts w:ascii="Times New Roman" w:hAnsi="Times New Roman" w:cs="Times New Roman"/>
-        </w:rPr>
-        <w:t>age</w:t>
-      </w:r>
-      <w:proofErr w:type="gramEnd"/>
-      <w:r>
-        <w:rPr>
-          <w:rFonts w:ascii="Times New Roman" w:hAnsi="Times New Roman" w:cs="Times New Roman"/>
-        </w:rPr>
-        <w:t>, Age, and AGE are treated as three entirely different variables.</w:t>
+      <w:r>
+        <w:rPr>
+          <w:rFonts w:ascii="Times New Roman" w:hAnsi="Times New Roman" w:cs="Times New Roman"/>
+        </w:rPr>
+        <w:t>age, Age, and AGE are treated as three entirely different variables.</w:t>
       </w:r>
     </w:p>
     <w:p>
@@ -348,58 +338,8 @@
         <w:rPr>
           <w:rFonts w:ascii="Times New Roman" w:hAnsi="Times New Roman" w:cs="Times New Roman"/>
         </w:rPr>
-        <w:t xml:space="preserve"> ‘</w:t>
-      </w:r>
-      <w:proofErr w:type="spellStart"/>
-      <w:r>
-        <w:rPr>
-          <w:rFonts w:ascii="Times New Roman" w:hAnsi="Times New Roman" w:cs="Times New Roman"/>
-        </w:rPr>
-        <w:t>tj</w:t>
-      </w:r>
-      <w:proofErr w:type="spellEnd"/>
-      <w:r>
-        <w:rPr>
-          <w:rFonts w:ascii="Times New Roman" w:hAnsi="Times New Roman" w:cs="Times New Roman"/>
-        </w:rPr>
-        <w:t>’, “</w:t>
-      </w:r>
-      <w:proofErr w:type="spellStart"/>
-      <w:r>
-        <w:rPr>
-          <w:rFonts w:ascii="Times New Roman" w:hAnsi="Times New Roman" w:cs="Times New Roman"/>
-        </w:rPr>
-        <w:t>tj</w:t>
-      </w:r>
-      <w:proofErr w:type="spellEnd"/>
-      <w:r>
-        <w:rPr>
-          <w:rFonts w:ascii="Times New Roman" w:hAnsi="Times New Roman" w:cs="Times New Roman"/>
-        </w:rPr>
-        <w:t>”</w:t>
-      </w:r>
-      <w:proofErr w:type="gramStart"/>
-      <w:r>
-        <w:rPr>
-          <w:rFonts w:ascii="Times New Roman" w:hAnsi="Times New Roman" w:cs="Times New Roman"/>
-        </w:rPr>
-        <w:t>,  ‘’’</w:t>
-      </w:r>
-      <w:proofErr w:type="spellStart"/>
-      <w:r>
-        <w:rPr>
-          <w:rFonts w:ascii="Times New Roman" w:hAnsi="Times New Roman" w:cs="Times New Roman"/>
-        </w:rPr>
-        <w:t>tj</w:t>
-      </w:r>
-      <w:proofErr w:type="spellEnd"/>
-      <w:r>
-        <w:rPr>
-          <w:rFonts w:ascii="Times New Roman" w:hAnsi="Times New Roman" w:cs="Times New Roman"/>
-        </w:rPr>
-        <w:t>’’‘</w:t>
-      </w:r>
-      <w:proofErr w:type="gramEnd"/>
+        <w:t xml:space="preserve"> ‘tj’, “tj”,  ‘’’tj’’‘</w:t>
+      </w:r>
       <w:r>
         <w:rPr>
           <w:rFonts w:ascii="Times New Roman" w:hAnsi="Times New Roman" w:cs="Times New Roman"/>
@@ -460,21 +400,7 @@
         <w:rPr>
           <w:rFonts w:ascii="Times New Roman" w:hAnsi="Times New Roman" w:cs="Times New Roman"/>
         </w:rPr>
-        <w:t xml:space="preserve">er ‘True’ or ‘False’ is Boolean, example </w:t>
-      </w:r>
-      <w:proofErr w:type="spellStart"/>
-      <w:r>
-        <w:rPr>
-          <w:rFonts w:ascii="Times New Roman" w:hAnsi="Times New Roman" w:cs="Times New Roman"/>
-        </w:rPr>
-        <w:t>isActive</w:t>
-      </w:r>
-      <w:proofErr w:type="spellEnd"/>
-      <w:r>
-        <w:rPr>
-          <w:rFonts w:ascii="Times New Roman" w:hAnsi="Times New Roman" w:cs="Times New Roman"/>
-        </w:rPr>
-        <w:t xml:space="preserve"> = True/False</w:t>
+        <w:t>er ‘True’ or ‘False’ is Boolean, example isActive = True/False</w:t>
       </w:r>
     </w:p>
     <w:p>
@@ -493,30 +419,8 @@
         <w:rPr>
           <w:rFonts w:ascii="Times New Roman" w:hAnsi="Times New Roman" w:cs="Times New Roman"/>
         </w:rPr>
-        <w:t xml:space="preserve">itialize is set to </w:t>
-      </w:r>
-      <w:proofErr w:type="gramStart"/>
-      <w:r>
-        <w:rPr>
-          <w:rFonts w:ascii="Times New Roman" w:hAnsi="Times New Roman" w:cs="Times New Roman"/>
-        </w:rPr>
-        <w:t>None</w:t>
-      </w:r>
-      <w:proofErr w:type="gramEnd"/>
-      <w:r>
-        <w:rPr>
-          <w:rFonts w:ascii="Times New Roman" w:hAnsi="Times New Roman" w:cs="Times New Roman"/>
-        </w:rPr>
-        <w:t xml:space="preserve">, example: </w:t>
-      </w:r>
-      <w:proofErr w:type="spellStart"/>
-      <w:r>
-        <w:rPr>
-          <w:rFonts w:ascii="Times New Roman" w:hAnsi="Times New Roman" w:cs="Times New Roman"/>
-        </w:rPr>
-        <w:t>isActive</w:t>
-      </w:r>
-      <w:proofErr w:type="spellEnd"/>
+        <w:t>itialize is set to None, example: isActive</w:t>
+      </w:r>
       <w:r>
         <w:rPr>
           <w:rFonts w:ascii="Times New Roman" w:hAnsi="Times New Roman" w:cs="Times New Roman"/>
@@ -560,47 +464,11 @@
           <w:rFonts w:ascii="Times New Roman" w:hAnsi="Times New Roman" w:cs="Times New Roman"/>
         </w:rPr>
       </w:pPr>
-      <w:proofErr w:type="gramStart"/>
-      <w:r>
-        <w:rPr>
-          <w:rFonts w:ascii="Times New Roman" w:hAnsi="Times New Roman" w:cs="Times New Roman"/>
-        </w:rPr>
-        <w:t>and</w:t>
-      </w:r>
-      <w:proofErr w:type="gramEnd"/>
-      <w:r>
-        <w:rPr>
-          <w:rFonts w:ascii="Times New Roman" w:hAnsi="Times New Roman" w:cs="Times New Roman"/>
-        </w:rPr>
-        <w:t xml:space="preserve">, as, assert, break, class, continue, </w:t>
-      </w:r>
-      <w:proofErr w:type="spellStart"/>
-      <w:r>
-        <w:rPr>
-          <w:rFonts w:ascii="Times New Roman" w:hAnsi="Times New Roman" w:cs="Times New Roman"/>
-        </w:rPr>
-        <w:t>def</w:t>
-      </w:r>
-      <w:proofErr w:type="spellEnd"/>
-      <w:r>
-        <w:rPr>
-          <w:rFonts w:ascii="Times New Roman" w:hAnsi="Times New Roman" w:cs="Times New Roman"/>
-        </w:rPr>
-        <w:t xml:space="preserve">, del, </w:t>
-      </w:r>
-      <w:proofErr w:type="spellStart"/>
-      <w:r>
-        <w:rPr>
-          <w:rFonts w:ascii="Times New Roman" w:hAnsi="Times New Roman" w:cs="Times New Roman"/>
-        </w:rPr>
-        <w:t>elif</w:t>
-      </w:r>
-      <w:proofErr w:type="spellEnd"/>
-      <w:r>
-        <w:rPr>
-          <w:rFonts w:ascii="Times New Roman" w:hAnsi="Times New Roman" w:cs="Times New Roman"/>
-        </w:rPr>
-        <w:t>, else, except, finally, false, for, from, global, if, import, in, is, lambda, nonlocal, None, not, or, pass, raise, return, True, try, with, while, yield.</w:t>
+      <w:r>
+        <w:rPr>
+          <w:rFonts w:ascii="Times New Roman" w:hAnsi="Times New Roman" w:cs="Times New Roman"/>
+        </w:rPr>
+        <w:t>and, as, assert, break, class, continue, def, del, elif, else, except, finally, false, for, from, global, if, import, in, is, lambda, nonlocal, None, not, or, pass, raise, return, True, try, with, while, yield.</w:t>
       </w:r>
     </w:p>
     <w:p>
@@ -674,35 +542,7 @@
         <w:rPr>
           <w:rFonts w:ascii="Times New Roman" w:hAnsi="Times New Roman" w:cs="Times New Roman"/>
         </w:rPr>
-        <w:t>Example sum=</w:t>
-      </w:r>
-      <w:proofErr w:type="spellStart"/>
-      <w:r>
-        <w:rPr>
-          <w:rFonts w:ascii="Times New Roman" w:hAnsi="Times New Roman" w:cs="Times New Roman"/>
-        </w:rPr>
-        <w:t>a+b</w:t>
-      </w:r>
-      <w:proofErr w:type="spellEnd"/>
-      <w:r>
-        <w:rPr>
-          <w:rFonts w:ascii="Times New Roman" w:hAnsi="Times New Roman" w:cs="Times New Roman"/>
-        </w:rPr>
-        <w:t xml:space="preserve"> #</w:t>
-      </w:r>
-      <w:proofErr w:type="gramStart"/>
-      <w:r>
-        <w:rPr>
-          <w:rFonts w:ascii="Times New Roman" w:hAnsi="Times New Roman" w:cs="Times New Roman"/>
-        </w:rPr>
-        <w:t>This</w:t>
-      </w:r>
-      <w:proofErr w:type="gramEnd"/>
-      <w:r>
-        <w:rPr>
-          <w:rFonts w:ascii="Times New Roman" w:hAnsi="Times New Roman" w:cs="Times New Roman"/>
-        </w:rPr>
-        <w:t xml:space="preserve"> is line mea</w:t>
+        <w:t>Example sum=a+b #This is line mea</w:t>
       </w:r>
       <w:r>
         <w:rPr>
@@ -726,51 +566,7 @@
         <w:rPr>
           <w:rFonts w:ascii="Times New Roman" w:hAnsi="Times New Roman" w:cs="Times New Roman"/>
         </w:rPr>
-        <w:t>Multiple line comment: Python use triple double quotes to print multiple line comments “</w:t>
-      </w:r>
-      <w:r>
-        <w:rPr>
-          <w:rFonts w:ascii="Times New Roman" w:hAnsi="Times New Roman" w:cs="Times New Roman"/>
-        </w:rPr>
-        <w:t>““</w:t>
-      </w:r>
-      <w:r>
-        <w:rPr>
-          <w:rFonts w:ascii="Times New Roman" w:hAnsi="Times New Roman" w:cs="Times New Roman"/>
-        </w:rPr>
-        <w:t>statement</w:t>
-      </w:r>
-      <w:r>
-        <w:rPr>
-          <w:rFonts w:ascii="Times New Roman" w:hAnsi="Times New Roman" w:cs="Times New Roman"/>
-        </w:rPr>
-        <w:t>””</w:t>
-      </w:r>
-      <w:r>
-        <w:rPr>
-          <w:rFonts w:ascii="Times New Roman" w:hAnsi="Times New Roman" w:cs="Times New Roman"/>
-        </w:rPr>
-        <w:t>”, example sum =</w:t>
-      </w:r>
-      <w:proofErr w:type="spellStart"/>
-      <w:r>
-        <w:rPr>
-          <w:rFonts w:ascii="Times New Roman" w:hAnsi="Times New Roman" w:cs="Times New Roman"/>
-        </w:rPr>
-        <w:t>a+b</w:t>
-      </w:r>
-      <w:proofErr w:type="spellEnd"/>
-      <w:r>
-        <w:rPr>
-          <w:rFonts w:ascii="Times New Roman" w:hAnsi="Times New Roman" w:cs="Times New Roman"/>
-        </w:rPr>
-        <w:t xml:space="preserve"> </w:t>
-      </w:r>
-      <w:r>
-        <w:rPr>
-          <w:rFonts w:ascii="Times New Roman" w:hAnsi="Times New Roman" w:cs="Times New Roman"/>
-        </w:rPr>
-        <w:t>“““This is line means to calculate two value”””</w:t>
+        <w:t>Multiple line comment: Python use triple double quotes to print multiple line comments “““statement”””, example sum =a+b “““This is line means to calculate two value”””</w:t>
       </w:r>
       <w:r>
         <w:rPr>
@@ -836,21 +632,7 @@
         <w:rPr>
           <w:rFonts w:ascii="Times New Roman" w:hAnsi="Times New Roman" w:cs="Times New Roman"/>
         </w:rPr>
-        <w:t xml:space="preserve">: +, -, *, /, %, ** this operator are used to do any mathematical operations. In python when we use divide it always gives the </w:t>
-      </w:r>
-      <w:proofErr w:type="spellStart"/>
-      <w:r>
-        <w:rPr>
-          <w:rFonts w:ascii="Times New Roman" w:hAnsi="Times New Roman" w:cs="Times New Roman"/>
-        </w:rPr>
-        <w:t>ouput</w:t>
-      </w:r>
-      <w:proofErr w:type="spellEnd"/>
-      <w:r>
-        <w:rPr>
-          <w:rFonts w:ascii="Times New Roman" w:hAnsi="Times New Roman" w:cs="Times New Roman"/>
-        </w:rPr>
-        <w:t xml:space="preserve"> in decimal,  </w:t>
+        <w:t xml:space="preserve">: +, -, *, /, %, ** this operator are used to do any mathematical operations. In python when we use divide it always gives the ouput in decimal,  </w:t>
       </w:r>
     </w:p>
     <w:p>
@@ -894,31 +676,11 @@
         </w:rPr>
         <w:t>Assignment Operators</w:t>
       </w:r>
-      <w:proofErr w:type="gramStart"/>
-      <w:r>
-        <w:rPr>
-          <w:rFonts w:ascii="Times New Roman" w:hAnsi="Times New Roman" w:cs="Times New Roman"/>
-        </w:rPr>
-        <w:t>:</w:t>
-      </w:r>
-      <w:r>
-        <w:rPr>
-          <w:rFonts w:ascii="Times New Roman" w:hAnsi="Times New Roman" w:cs="Times New Roman"/>
-        </w:rPr>
-        <w:t>=</w:t>
-      </w:r>
-      <w:proofErr w:type="gramEnd"/>
-      <w:r>
-        <w:rPr>
-          <w:rFonts w:ascii="Times New Roman" w:hAnsi="Times New Roman" w:cs="Times New Roman"/>
-        </w:rPr>
-        <w:t>, +=, -=,*=, /=</w:t>
-      </w:r>
-      <w:r>
-        <w:rPr>
-          <w:rFonts w:ascii="Times New Roman" w:hAnsi="Times New Roman" w:cs="Times New Roman"/>
-        </w:rPr>
-        <w:t>, %=, **=,  This operator are used to do operation and assign value to operand or variable</w:t>
+      <w:r>
+        <w:rPr>
+          <w:rFonts w:ascii="Times New Roman" w:hAnsi="Times New Roman" w:cs="Times New Roman"/>
+        </w:rPr>
+        <w:t>:=, +=, -=,*=, /=, %=, **=,  This operator are used to do operation and assign value to operand or variable</w:t>
       </w:r>
       <w:r>
         <w:rPr>
@@ -954,21 +716,7 @@
         <w:rPr>
           <w:rFonts w:ascii="Times New Roman" w:hAnsi="Times New Roman" w:cs="Times New Roman"/>
         </w:rPr>
-        <w:t xml:space="preserve">: not, and, or this operators works on Boolean value. Not operator always gives the opposite output for final output, like if </w:t>
-      </w:r>
-      <w:proofErr w:type="spellStart"/>
-      <w:r>
-        <w:rPr>
-          <w:rFonts w:ascii="Times New Roman" w:hAnsi="Times New Roman" w:cs="Times New Roman"/>
-        </w:rPr>
-        <w:t>its</w:t>
-      </w:r>
-      <w:proofErr w:type="spellEnd"/>
-      <w:r>
-        <w:rPr>
-          <w:rFonts w:ascii="Times New Roman" w:hAnsi="Times New Roman" w:cs="Times New Roman"/>
-        </w:rPr>
-        <w:t xml:space="preserve"> true then it return false.</w:t>
+        <w:t>: not, and, or this operators works on Boolean value. Not operator always gives the opposite output for final output, like if its true then it return false.</w:t>
       </w:r>
     </w:p>
     <w:p>
@@ -1224,19 +972,11 @@
         </w:rPr>
         <w:t xml:space="preserve">= </w:t>
       </w:r>
-      <w:proofErr w:type="gramStart"/>
-      <w:r>
-        <w:rPr>
-          <w:rFonts w:ascii="Times New Roman" w:hAnsi="Times New Roman" w:cs="Times New Roman"/>
-        </w:rPr>
-        <w:t>float(</w:t>
-      </w:r>
-      <w:proofErr w:type="gramEnd"/>
-      <w:r>
-        <w:rPr>
-          <w:rFonts w:ascii="Times New Roman" w:hAnsi="Times New Roman" w:cs="Times New Roman"/>
-        </w:rPr>
-        <w:t>“T”)</w:t>
+      <w:r>
+        <w:rPr>
+          <w:rFonts w:ascii="Times New Roman" w:hAnsi="Times New Roman" w:cs="Times New Roman"/>
+        </w:rPr>
+        <w:t>float(“T”)</w:t>
       </w:r>
     </w:p>
     <w:p>
@@ -1315,11 +1055,6 @@
           <w:rFonts w:ascii="Times New Roman" w:hAnsi="Times New Roman" w:cs="Times New Roman"/>
         </w:rPr>
         <w:tab/>
-      </w:r>
-      <w:r>
-        <w:rPr>
-          <w:rFonts w:ascii="Times New Roman" w:hAnsi="Times New Roman" w:cs="Times New Roman"/>
-        </w:rPr>
         <w:t xml:space="preserve">A </w:t>
       </w:r>
       <w:r>
@@ -1328,332 +1063,1941 @@
         </w:rPr>
         <w:t xml:space="preserve">= </w:t>
       </w:r>
-      <w:proofErr w:type="gramStart"/>
-      <w:r>
-        <w:rPr>
-          <w:rFonts w:ascii="Times New Roman" w:hAnsi="Times New Roman" w:cs="Times New Roman"/>
-        </w:rPr>
-        <w:t>float(</w:t>
-      </w:r>
-      <w:proofErr w:type="gramEnd"/>
-      <w:r>
-        <w:rPr>
-          <w:rFonts w:ascii="Times New Roman" w:hAnsi="Times New Roman" w:cs="Times New Roman"/>
+      <w:r>
+        <w:rPr>
+          <w:rFonts w:ascii="Times New Roman" w:hAnsi="Times New Roman" w:cs="Times New Roman"/>
+        </w:rPr>
+        <w:t>float(“2.2”)</w:t>
+      </w:r>
+    </w:p>
+    <w:p>
+      <w:pPr>
+        <w:pStyle w:val="ListParagraph"/>
+        <w:rPr>
+          <w:rFonts w:ascii="Times New Roman" w:hAnsi="Times New Roman" w:cs="Times New Roman"/>
+        </w:rPr>
+      </w:pPr>
+      <w:r>
+        <w:rPr>
+          <w:rFonts w:ascii="Times New Roman" w:hAnsi="Times New Roman" w:cs="Times New Roman"/>
+        </w:rPr>
+        <w:tab/>
+        <w:t>B = 1.2</w:t>
+      </w:r>
+    </w:p>
+    <w:p>
+      <w:pPr>
+        <w:pStyle w:val="ListParagraph"/>
+        <w:rPr>
+          <w:rFonts w:ascii="Times New Roman" w:hAnsi="Times New Roman" w:cs="Times New Roman"/>
+        </w:rPr>
+      </w:pPr>
+      <w:r>
+        <w:rPr>
+          <w:rFonts w:ascii="Times New Roman" w:hAnsi="Times New Roman" w:cs="Times New Roman"/>
+        </w:rPr>
+        <w:tab/>
+        <w:t>Sum = A + B</w:t>
+      </w:r>
+    </w:p>
+    <w:p>
+      <w:pPr>
+        <w:rPr>
+          <w:rFonts w:ascii="Times New Roman" w:hAnsi="Times New Roman" w:cs="Times New Roman"/>
+          <w:b/>
+          <w:bCs/>
+        </w:rPr>
+      </w:pPr>
+      <w:r>
+        <w:rPr>
+          <w:rFonts w:ascii="Times New Roman" w:hAnsi="Times New Roman" w:cs="Times New Roman"/>
+          <w:b/>
+          <w:bCs/>
+        </w:rPr>
+        <w:t xml:space="preserve">Python User interaction </w:t>
+      </w:r>
+      <w:r>
+        <w:rPr>
+          <w:rFonts w:ascii="Times New Roman" w:hAnsi="Times New Roman" w:cs="Times New Roman"/>
+          <w:b/>
+          <w:bCs/>
         </w:rPr>
         <w:t>“</w:t>
       </w:r>
       <w:r>
         <w:rPr>
           <w:rFonts w:ascii="Times New Roman" w:hAnsi="Times New Roman" w:cs="Times New Roman"/>
-        </w:rPr>
-        <w:t>2.2</w:t>
-      </w:r>
-      <w:r>
-        <w:rPr>
-          <w:rFonts w:ascii="Times New Roman" w:hAnsi="Times New Roman" w:cs="Times New Roman"/>
-        </w:rPr>
+          <w:b/>
+          <w:bCs/>
+        </w:rPr>
+        <w:t xml:space="preserve">Use of </w:t>
+      </w:r>
+      <w:r>
+        <w:rPr>
+          <w:rFonts w:ascii="Times New Roman" w:hAnsi="Times New Roman" w:cs="Times New Roman"/>
+          <w:b/>
+          <w:bCs/>
+        </w:rPr>
+        <w:t>Input()”</w:t>
+      </w:r>
+    </w:p>
+    <w:p>
+      <w:pPr>
+        <w:rPr>
+          <w:rFonts w:ascii="Times New Roman" w:hAnsi="Times New Roman" w:cs="Times New Roman"/>
+        </w:rPr>
+      </w:pPr>
+      <w:r>
+        <w:rPr>
+          <w:rFonts w:ascii="Times New Roman" w:hAnsi="Times New Roman" w:cs="Times New Roman"/>
+        </w:rPr>
+        <w:t xml:space="preserve">Input(): this is function </w:t>
+      </w:r>
+      <w:r>
+        <w:rPr>
+          <w:rFonts w:ascii="Times New Roman" w:hAnsi="Times New Roman" w:cs="Times New Roman"/>
+        </w:rPr>
+        <w:t>is used to accept data from the user</w:t>
+      </w:r>
+      <w:r>
+        <w:rPr>
+          <w:rFonts w:ascii="Times New Roman" w:hAnsi="Times New Roman" w:cs="Times New Roman"/>
+        </w:rPr>
+        <w:t xml:space="preserve"> at run time of program, we also can put some string or value inside that input to show message </w:t>
+      </w:r>
+      <w:r>
+        <w:rPr>
+          <w:rFonts w:ascii="Times New Roman" w:hAnsi="Times New Roman" w:cs="Times New Roman"/>
+        </w:rPr>
+        <w:t>to user, also we can save the value of user entered into variable. It result is always a string, we need to use type casting to convert the value into ap</w:t>
+      </w:r>
+      <w:r>
+        <w:rPr>
+          <w:rFonts w:ascii="Times New Roman" w:hAnsi="Times New Roman" w:cs="Times New Roman"/>
+        </w:rPr>
+        <w:t>propriate type user want.</w:t>
+      </w:r>
+    </w:p>
+    <w:p>
+      <w:pPr>
+        <w:rPr>
+          <w:rFonts w:ascii="Times New Roman" w:hAnsi="Times New Roman" w:cs="Times New Roman"/>
+        </w:rPr>
+      </w:pPr>
+      <w:r>
+        <w:rPr>
+          <w:rFonts w:ascii="Times New Roman" w:hAnsi="Times New Roman" w:cs="Times New Roman"/>
+        </w:rPr>
+        <w:t>Example:</w:t>
+      </w:r>
+      <w:r>
+        <w:rPr>
+          <w:rFonts w:ascii="Times New Roman" w:hAnsi="Times New Roman" w:cs="Times New Roman"/>
+        </w:rPr>
+        <w:tab/>
+      </w:r>
+    </w:p>
+    <w:p>
+      <w:pPr>
+        <w:rPr>
+          <w:rFonts w:ascii="Times New Roman" w:hAnsi="Times New Roman" w:cs="Times New Roman"/>
+        </w:rPr>
+      </w:pPr>
+      <w:r>
+        <w:rPr>
+          <w:rFonts w:ascii="Times New Roman" w:hAnsi="Times New Roman" w:cs="Times New Roman"/>
+        </w:rPr>
+        <w:tab/>
+        <w:t>name = input(“Enter User Name”)</w:t>
+      </w:r>
+    </w:p>
+    <w:p>
+      <w:pPr>
+        <w:rPr>
+          <w:rFonts w:ascii="Times New Roman" w:hAnsi="Times New Roman" w:cs="Times New Roman"/>
+        </w:rPr>
+      </w:pPr>
+      <w:r>
+        <w:rPr>
+          <w:rFonts w:ascii="Times New Roman" w:hAnsi="Times New Roman" w:cs="Times New Roman"/>
+        </w:rPr>
+        <w:t>Input() with type casting from string result to another</w:t>
+      </w:r>
+      <w:r>
+        <w:rPr>
+          <w:rFonts w:ascii="Times New Roman" w:hAnsi="Times New Roman" w:cs="Times New Roman"/>
+        </w:rPr>
+        <w:t xml:space="preserve"> data type at the time of accepting input from user.</w:t>
+      </w:r>
+      <w:r>
+        <w:rPr>
+          <w:rFonts w:ascii="Times New Roman" w:hAnsi="Times New Roman" w:cs="Times New Roman"/>
+        </w:rPr>
+        <w:t xml:space="preserve"> </w:t>
+      </w:r>
+    </w:p>
+    <w:p>
+      <w:pPr>
+        <w:rPr>
+          <w:rFonts w:ascii="Times New Roman" w:hAnsi="Times New Roman" w:cs="Times New Roman"/>
+        </w:rPr>
+      </w:pPr>
+      <w:r>
+        <w:rPr>
+          <w:rFonts w:ascii="Times New Roman" w:hAnsi="Times New Roman" w:cs="Times New Roman"/>
+        </w:rPr>
+        <w:t xml:space="preserve">Example: </w:t>
+      </w:r>
+    </w:p>
+    <w:p>
+      <w:pPr>
+        <w:ind w:firstLine="720"/>
+        <w:rPr>
+          <w:rFonts w:ascii="Times New Roman" w:hAnsi="Times New Roman" w:cs="Times New Roman"/>
+        </w:rPr>
+      </w:pPr>
+      <w:r>
+        <w:rPr>
+          <w:rFonts w:ascii="Times New Roman" w:hAnsi="Times New Roman" w:cs="Times New Roman"/>
+        </w:rPr>
+        <w:t>Age = int(input(“Enter Your Age”))</w:t>
+      </w:r>
+    </w:p>
+    <w:p>
+      <w:pPr>
+        <w:ind w:firstLine="720"/>
+        <w:rPr>
+          <w:rFonts w:ascii="Times New Roman" w:hAnsi="Times New Roman" w:cs="Times New Roman"/>
+        </w:rPr>
+      </w:pPr>
+      <w:r>
+        <w:rPr>
+          <w:rFonts w:ascii="Times New Roman" w:hAnsi="Times New Roman" w:cs="Times New Roman"/>
+        </w:rPr>
+        <w:t>Price = float(input(“Enter Price”))</w:t>
+      </w:r>
+    </w:p>
+    <w:p>
+      <w:pPr>
+        <w:rPr>
+          <w:rFonts w:ascii="Times New Roman" w:hAnsi="Times New Roman" w:cs="Times New Roman"/>
+          <w:b/>
+          <w:bCs/>
+        </w:rPr>
+      </w:pPr>
+      <w:r>
+        <w:rPr>
+          <w:rFonts w:ascii="Times New Roman" w:hAnsi="Times New Roman" w:cs="Times New Roman"/>
+          <w:b/>
+          <w:bCs/>
+        </w:rPr>
+        <w:lastRenderedPageBreak/>
+        <w:t>Lecture</w:t>
+      </w:r>
+      <w:r>
+        <w:rPr>
+          <w:rFonts w:ascii="Times New Roman" w:hAnsi="Times New Roman" w:cs="Times New Roman"/>
+          <w:b/>
+          <w:bCs/>
+        </w:rPr>
+        <w:t xml:space="preserve"> 2</w:t>
+      </w:r>
+      <w:r>
+        <w:rPr>
+          <w:rFonts w:ascii="Times New Roman" w:hAnsi="Times New Roman" w:cs="Times New Roman"/>
+          <w:b/>
+          <w:bCs/>
+        </w:rPr>
+        <w:t xml:space="preserve">: </w:t>
+      </w:r>
+    </w:p>
+    <w:p>
+      <w:pPr>
+        <w:rPr>
+          <w:rFonts w:ascii="Times New Roman" w:hAnsi="Times New Roman" w:cs="Times New Roman"/>
+          <w:b/>
+          <w:bCs/>
+        </w:rPr>
+      </w:pPr>
+      <w:r>
+        <w:rPr>
+          <w:rFonts w:ascii="Times New Roman" w:hAnsi="Times New Roman" w:cs="Times New Roman"/>
+          <w:b/>
+          <w:bCs/>
+        </w:rPr>
+        <w:t>String</w:t>
+      </w:r>
+    </w:p>
+    <w:p>
+      <w:pPr>
+        <w:rPr>
+          <w:rFonts w:ascii="Times New Roman" w:hAnsi="Times New Roman" w:cs="Times New Roman"/>
+        </w:rPr>
+      </w:pPr>
+      <w:r>
+        <w:rPr>
+          <w:rFonts w:ascii="Times New Roman" w:hAnsi="Times New Roman" w:cs="Times New Roman"/>
+        </w:rPr>
+        <w:t>String is data type is sequence of character in group of sentence, paragraph or single character is is binded with ‘’, “”, “</w:t>
+      </w:r>
+      <w:r>
+        <w:rPr>
+          <w:rFonts w:ascii="Times New Roman" w:hAnsi="Times New Roman" w:cs="Times New Roman"/>
+        </w:rPr>
+        <w:t>““””</w:t>
+      </w:r>
+      <w:r>
+        <w:rPr>
+          <w:rFonts w:ascii="Times New Roman" w:hAnsi="Times New Roman" w:cs="Times New Roman"/>
+        </w:rPr>
+        <w:t>” is called string.</w:t>
+      </w:r>
+      <w:r>
+        <w:rPr>
+          <w:rFonts w:ascii="Times New Roman" w:hAnsi="Times New Roman" w:cs="Times New Roman"/>
+        </w:rPr>
+        <w:t xml:space="preserve"> String in python is immutable object once the object is created it cannot be changed or modified. To do that python creates the copy of original string do the operation without modifying original string</w:t>
+      </w:r>
+    </w:p>
+    <w:p>
+      <w:pPr>
+        <w:rPr>
+          <w:rFonts w:ascii="Times New Roman" w:hAnsi="Times New Roman" w:cs="Times New Roman"/>
+          <w:b/>
+          <w:bCs/>
+        </w:rPr>
+      </w:pPr>
+      <w:r>
+        <w:rPr>
+          <w:rFonts w:ascii="Times New Roman" w:hAnsi="Times New Roman" w:cs="Times New Roman"/>
+          <w:b/>
+          <w:bCs/>
+        </w:rPr>
+        <w:t>Basic operation on stirng</w:t>
+      </w:r>
+    </w:p>
+    <w:p>
+      <w:pPr>
+        <w:pStyle w:val="ListParagraph"/>
+        <w:numPr>
+          <w:ilvl w:val="0"/>
+          <w:numId w:val="5"/>
+        </w:numPr>
+        <w:rPr>
+          <w:rFonts w:ascii="Times New Roman" w:hAnsi="Times New Roman" w:cs="Times New Roman"/>
+        </w:rPr>
+      </w:pPr>
+      <w:r>
+        <w:rPr>
+          <w:rFonts w:ascii="Times New Roman" w:hAnsi="Times New Roman" w:cs="Times New Roman"/>
+        </w:rPr>
+        <w:t xml:space="preserve">Escape sequence character: </w:t>
+      </w:r>
+      <w:r>
+        <w:rPr>
+          <w:rFonts w:ascii="Times New Roman" w:hAnsi="Times New Roman" w:cs="Times New Roman"/>
+        </w:rPr>
+        <w:t>This character are used to manipulate string like adding the tab space, to break in line.</w:t>
+      </w:r>
+      <w:r>
+        <w:rPr>
+          <w:rFonts w:ascii="Times New Roman" w:hAnsi="Times New Roman" w:cs="Times New Roman"/>
+        </w:rPr>
+        <w:t xml:space="preserve"> This </w:t>
+      </w:r>
+      <w:r>
+        <w:t>are useful when formatting strings, displaying output, and working with file paths.</w:t>
+      </w:r>
+    </w:p>
+    <w:p>
+      <w:pPr>
+        <w:pStyle w:val="ListParagraph"/>
+        <w:numPr>
+          <w:ilvl w:val="1"/>
+          <w:numId w:val="5"/>
+        </w:numPr>
+        <w:rPr>
+          <w:rFonts w:ascii="Times New Roman" w:hAnsi="Times New Roman" w:cs="Times New Roman"/>
+        </w:rPr>
+      </w:pPr>
+      <w:r>
+        <w:rPr>
+          <w:rFonts w:ascii="Times New Roman" w:hAnsi="Times New Roman" w:cs="Times New Roman"/>
+        </w:rPr>
+        <w:t>“\n”: This esc is used to push the statement to new line.</w:t>
+      </w:r>
+    </w:p>
+    <w:p>
+      <w:pPr>
+        <w:pStyle w:val="ListParagraph"/>
+        <w:numPr>
+          <w:ilvl w:val="1"/>
+          <w:numId w:val="5"/>
+        </w:numPr>
+        <w:rPr>
+          <w:rFonts w:ascii="Times New Roman" w:hAnsi="Times New Roman" w:cs="Times New Roman"/>
+        </w:rPr>
+      </w:pPr>
+      <w:r>
+        <w:rPr>
+          <w:rFonts w:ascii="Times New Roman" w:hAnsi="Times New Roman" w:cs="Times New Roman"/>
+        </w:rPr>
+        <w:t>“\t”: This esc is used to add ‘1’ tab space between character, statement.</w:t>
+      </w:r>
+    </w:p>
+    <w:p>
+      <w:pPr>
+        <w:pStyle w:val="ListParagraph"/>
+        <w:numPr>
+          <w:ilvl w:val="0"/>
+          <w:numId w:val="5"/>
+        </w:numPr>
+        <w:rPr>
+          <w:rFonts w:ascii="Times New Roman" w:hAnsi="Times New Roman" w:cs="Times New Roman"/>
+        </w:rPr>
+      </w:pPr>
+      <w:r>
+        <w:rPr>
+          <w:rFonts w:ascii="Times New Roman" w:hAnsi="Times New Roman" w:cs="Times New Roman"/>
+        </w:rPr>
+        <w:t>Concatenation: To add two different string into one is called concatenation, we use ‘+’ operation to do.</w:t>
+      </w:r>
+    </w:p>
+    <w:p>
+      <w:pPr>
+        <w:ind w:left="720"/>
+        <w:rPr>
+          <w:rFonts w:ascii="Times New Roman" w:hAnsi="Times New Roman" w:cs="Times New Roman"/>
+        </w:rPr>
+      </w:pPr>
+      <w:r>
+        <w:rPr>
+          <w:rFonts w:ascii="Times New Roman" w:hAnsi="Times New Roman" w:cs="Times New Roman"/>
+        </w:rPr>
+        <w:t>Example:</w:t>
+      </w:r>
+    </w:p>
+    <w:p>
+      <w:pPr>
+        <w:ind w:left="720"/>
+        <w:rPr>
+          <w:rFonts w:ascii="Times New Roman" w:hAnsi="Times New Roman" w:cs="Times New Roman"/>
+        </w:rPr>
+      </w:pPr>
+      <w:r>
+        <w:rPr>
+          <w:rFonts w:ascii="Times New Roman" w:hAnsi="Times New Roman" w:cs="Times New Roman"/>
+        </w:rPr>
+        <w:tab/>
+        <w:t>firstName= “Tejas”</w:t>
+      </w:r>
+    </w:p>
+    <w:p>
+      <w:pPr>
+        <w:ind w:left="720"/>
+        <w:rPr>
+          <w:rFonts w:ascii="Times New Roman" w:hAnsi="Times New Roman" w:cs="Times New Roman"/>
+        </w:rPr>
+      </w:pPr>
+      <w:r>
+        <w:rPr>
+          <w:rFonts w:ascii="Times New Roman" w:hAnsi="Times New Roman" w:cs="Times New Roman"/>
+        </w:rPr>
+        <w:tab/>
+        <w:t>lastName=”Jawalkar”</w:t>
+      </w:r>
+    </w:p>
+    <w:p>
+      <w:pPr>
+        <w:ind w:left="720"/>
+        <w:rPr>
+          <w:rFonts w:ascii="Times New Roman" w:hAnsi="Times New Roman" w:cs="Times New Roman"/>
+        </w:rPr>
+      </w:pPr>
+      <w:r>
+        <w:rPr>
+          <w:rFonts w:ascii="Times New Roman" w:hAnsi="Times New Roman" w:cs="Times New Roman"/>
+        </w:rPr>
+        <w:tab/>
+        <w:t>fullName = firstName+lastName</w:t>
+      </w:r>
+    </w:p>
+    <w:p>
+      <w:pPr>
+        <w:pStyle w:val="ListParagraph"/>
+        <w:numPr>
+          <w:ilvl w:val="0"/>
+          <w:numId w:val="5"/>
+        </w:numPr>
+        <w:rPr>
+          <w:rFonts w:ascii="Times New Roman" w:hAnsi="Times New Roman" w:cs="Times New Roman"/>
+        </w:rPr>
+      </w:pPr>
+      <w:r>
+        <w:rPr>
+          <w:rFonts w:ascii="Times New Roman" w:hAnsi="Times New Roman" w:cs="Times New Roman"/>
+        </w:rPr>
+        <w:t xml:space="preserve">Indexing: </w:t>
+      </w:r>
+      <w:r>
+        <w:t>In Python, an index is the position number of a character inside a string.</w:t>
+      </w:r>
+      <w:r>
+        <w:t xml:space="preserve"> </w:t>
+      </w:r>
+      <w:r>
+        <w:t xml:space="preserve">Python uses zero-based indexing, which means the first character starts at index </w:t>
+      </w:r>
+      <w:r>
+        <w:rPr>
+          <w:rStyle w:val="HTMLCode"/>
+          <w:rFonts w:eastAsiaTheme="minorHAnsi"/>
+        </w:rPr>
+        <w:t>0</w:t>
+      </w:r>
+      <w:r>
+        <w:t>.</w:t>
+      </w:r>
+    </w:p>
+    <w:p>
+      <w:pPr>
+        <w:pStyle w:val="ListParagraph"/>
+      </w:pPr>
+      <w:r>
+        <w:t>Like you want find which character is present on following index of string for that use need to specify the string[index]. And you cannon to modification on index like replace the character or remove it.</w:t>
+      </w:r>
+    </w:p>
+    <w:p>
+      <w:pPr>
+        <w:pStyle w:val="ListParagraph"/>
+      </w:pPr>
+      <w:r>
+        <w:t>Example:</w:t>
+      </w:r>
+    </w:p>
+    <w:p>
+      <w:pPr>
+        <w:pStyle w:val="ListParagraph"/>
+      </w:pPr>
+      <w:r>
+        <w:tab/>
+        <w:t>Phrase_1= “This is python”</w:t>
+      </w:r>
+    </w:p>
+    <w:p>
+      <w:pPr>
+        <w:pStyle w:val="ListParagraph"/>
+      </w:pPr>
+      <w:r>
+        <w:tab/>
+        <w:t>Print(phrase[3]),  It will print ‘s’ as a output.</w:t>
+      </w:r>
+    </w:p>
+    <w:p>
+      <w:pPr>
+        <w:pStyle w:val="ListParagraph"/>
+      </w:pPr>
+    </w:p>
+    <w:p>
+      <w:pPr>
+        <w:pStyle w:val="ListParagraph"/>
+      </w:pPr>
+      <w:r>
+        <w:t xml:space="preserve">Slicing: </w:t>
+      </w:r>
+      <w:r>
+        <w:t xml:space="preserve">Accessing part of string, </w:t>
+      </w:r>
+      <w:r>
+        <w:t>Specify the start index and the end index, separated by a colon, to return a part of the string.</w:t>
+      </w:r>
+    </w:p>
+    <w:p>
+      <w:pPr>
+        <w:pStyle w:val="ListParagraph"/>
+      </w:pPr>
+      <w:r>
+        <w:t>Example:</w:t>
+      </w:r>
+    </w:p>
+    <w:p>
+      <w:pPr>
+        <w:pStyle w:val="ListParagraph"/>
+      </w:pPr>
+      <w:r>
+        <w:tab/>
+        <w:t>Phrease_1 = “</w:t>
+      </w:r>
+      <w:r>
+        <w:t>This is python</w:t>
+      </w:r>
+      <w:r>
+        <w:t>”</w:t>
+      </w:r>
+    </w:p>
+    <w:p>
+      <w:pPr>
+        <w:pStyle w:val="ListParagraph"/>
+      </w:pPr>
+      <w:r>
+        <w:tab/>
+        <w:t xml:space="preserve">Print(phrease_1[1,4]), </w:t>
+      </w:r>
+      <w:r>
+        <w:tab/>
+      </w:r>
+    </w:p>
+    <w:p>
+      <w:pPr>
+        <w:pStyle w:val="ListParagraph"/>
+        <w:ind w:firstLine="720"/>
+      </w:pPr>
+      <w:r>
+        <w:t>Print(phrease_1[</w:t>
+      </w:r>
+      <w:r>
+        <w:t>,4</w:t>
+      </w:r>
+      <w:r>
+        <w:t>])</w:t>
+      </w:r>
+      <w:r>
+        <w:t xml:space="preserve"> by it will consider it from start </w:t>
+      </w:r>
+    </w:p>
+    <w:p>
+      <w:pPr>
+        <w:pStyle w:val="ListParagraph"/>
+        <w:ind w:firstLine="720"/>
+      </w:pPr>
+      <w:r>
+        <w:t>Print(phrease_1[</w:t>
+      </w:r>
+      <w:r>
+        <w:t>5,</w:t>
+      </w:r>
+      <w:r>
+        <w:t>]) b</w:t>
+      </w:r>
+      <w:r>
+        <w:t>y it will consider it till end of string</w:t>
+      </w:r>
+    </w:p>
+    <w:p>
+      <w:pPr>
+        <w:pStyle w:val="ListParagraph"/>
+        <w:ind w:firstLine="720"/>
+      </w:pPr>
+    </w:p>
+    <w:p>
+      <w:pPr>
+        <w:pStyle w:val="ListParagraph"/>
+        <w:ind w:firstLine="720"/>
+      </w:pPr>
+      <w:r>
+        <w:lastRenderedPageBreak/>
+        <w:t>Negative indexing</w:t>
+      </w:r>
+    </w:p>
+    <w:p>
+      <w:pPr>
+        <w:pStyle w:val="ListParagraph"/>
+        <w:ind w:firstLine="720"/>
+      </w:pPr>
+      <w:r>
+        <w:t>Print(phrease_1[</w:t>
+      </w:r>
+      <w:r>
+        <w:t>-4,-1</w:t>
+      </w:r>
+      <w:r>
+        <w:t>])</w:t>
+      </w:r>
+    </w:p>
+    <w:p>
+      <w:pPr>
+        <w:rPr>
+          <w:rFonts w:ascii="Segoe UI" w:hAnsi="Segoe UI" w:cs="Segoe UI"/>
+          <w:b/>
+          <w:bCs/>
+          <w:color w:val="000000"/>
+          <w:shd w:val="clear" w:color="auto" w:fill="FFFFFF"/>
+        </w:rPr>
+      </w:pPr>
+      <w:r>
+        <w:rPr>
+          <w:rFonts w:ascii="Segoe UI" w:hAnsi="Segoe UI" w:cs="Segoe UI"/>
+          <w:b/>
+          <w:bCs/>
+          <w:color w:val="000000"/>
+          <w:shd w:val="clear" w:color="auto" w:fill="FFFFFF"/>
+        </w:rPr>
+        <w:t>String Functions</w:t>
+      </w:r>
+      <w:r>
+        <w:rPr>
+          <w:rFonts w:ascii="Segoe UI" w:hAnsi="Segoe UI" w:cs="Segoe UI"/>
+          <w:b/>
+          <w:bCs/>
+          <w:color w:val="000000"/>
+          <w:shd w:val="clear" w:color="auto" w:fill="FFFFFF"/>
+        </w:rPr>
+        <w:t xml:space="preserve"> </w:t>
+      </w:r>
+    </w:p>
+    <w:p>
+      <w:pPr>
+        <w:pStyle w:val="ListParagraph"/>
+        <w:numPr>
+          <w:ilvl w:val="0"/>
+          <w:numId w:val="6"/>
+        </w:numPr>
+        <w:rPr>
+          <w:rFonts w:ascii="Segoe UI" w:hAnsi="Segoe UI" w:cs="Segoe UI"/>
+          <w:color w:val="000000"/>
+          <w:shd w:val="clear" w:color="auto" w:fill="FFFFFF"/>
+        </w:rPr>
+      </w:pPr>
+      <w:r>
+        <w:rPr>
+          <w:rFonts w:ascii="Times New Roman" w:hAnsi="Times New Roman" w:cs="Times New Roman"/>
+        </w:rPr>
+        <w:t>l</w:t>
+      </w:r>
+      <w:r>
+        <w:rPr>
+          <w:rFonts w:ascii="Times New Roman" w:hAnsi="Times New Roman" w:cs="Times New Roman"/>
+        </w:rPr>
+        <w:t>en()</w:t>
+      </w:r>
+      <w:r>
+        <w:rPr>
+          <w:rFonts w:ascii="Times New Roman" w:hAnsi="Times New Roman" w:cs="Times New Roman"/>
+        </w:rPr>
+        <w:t>: Len</w:t>
+      </w:r>
+      <w:r>
+        <w:rPr>
+          <w:rFonts w:ascii="Times New Roman" w:hAnsi="Times New Roman" w:cs="Times New Roman"/>
+        </w:rPr>
+        <w:t>g</w:t>
+      </w:r>
+      <w:r>
+        <w:rPr>
+          <w:rFonts w:ascii="Times New Roman" w:hAnsi="Times New Roman" w:cs="Times New Roman"/>
+        </w:rPr>
+        <w:t>th is used to find the size of string or statement it include space as string.</w:t>
+      </w:r>
+    </w:p>
+    <w:p>
+      <w:pPr>
+        <w:ind w:left="720"/>
+        <w:rPr>
+          <w:rFonts w:ascii="Times New Roman" w:hAnsi="Times New Roman" w:cs="Times New Roman"/>
+        </w:rPr>
+      </w:pPr>
+      <w:r>
+        <w:rPr>
+          <w:rFonts w:ascii="Times New Roman" w:hAnsi="Times New Roman" w:cs="Times New Roman"/>
+        </w:rPr>
+        <w:t>Example:</w:t>
+      </w:r>
+    </w:p>
+    <w:p>
+      <w:pPr>
+        <w:ind w:left="720"/>
+        <w:rPr>
+          <w:rFonts w:ascii="Times New Roman" w:hAnsi="Times New Roman" w:cs="Times New Roman"/>
+        </w:rPr>
+      </w:pPr>
+      <w:r>
+        <w:rPr>
+          <w:rFonts w:ascii="Times New Roman" w:hAnsi="Times New Roman" w:cs="Times New Roman"/>
+        </w:rPr>
+        <w:tab/>
+        <w:t>Statement=”This is my python brush up”.</w:t>
+      </w:r>
+    </w:p>
+    <w:p>
+      <w:pPr>
+        <w:pStyle w:val="ListParagraph"/>
+        <w:rPr>
+          <w:rFonts w:ascii="Times New Roman" w:hAnsi="Times New Roman" w:cs="Times New Roman"/>
+        </w:rPr>
+      </w:pPr>
+      <w:r>
+        <w:rPr>
+          <w:rFonts w:ascii="Times New Roman" w:hAnsi="Times New Roman" w:cs="Times New Roman"/>
+        </w:rPr>
+        <w:tab/>
+        <w:t>len(statement)</w:t>
+      </w:r>
+    </w:p>
+    <w:p>
+      <w:pPr>
+        <w:pStyle w:val="ListParagraph"/>
+        <w:rPr>
+          <w:rFonts w:ascii="Times New Roman" w:hAnsi="Times New Roman" w:cs="Times New Roman"/>
+        </w:rPr>
+      </w:pPr>
+    </w:p>
+    <w:p>
+      <w:pPr>
+        <w:pStyle w:val="ListParagraph"/>
+        <w:numPr>
+          <w:ilvl w:val="0"/>
+          <w:numId w:val="6"/>
+        </w:numPr>
+      </w:pPr>
+      <w:r>
+        <w:t>endsWith(): it return true if string is ending with given character</w:t>
+      </w:r>
+      <w:r>
+        <w:t xml:space="preserve"> and it’s case sensitive.</w:t>
+      </w:r>
+    </w:p>
+    <w:p>
+      <w:pPr>
+        <w:pStyle w:val="ListParagraph"/>
+      </w:pPr>
+      <w:r>
+        <w:t>Example:</w:t>
+      </w:r>
+    </w:p>
+    <w:p>
+      <w:pPr>
+        <w:ind w:left="720"/>
+        <w:rPr>
+          <w:rFonts w:ascii="Times New Roman" w:hAnsi="Times New Roman" w:cs="Times New Roman"/>
+        </w:rPr>
+      </w:pPr>
+      <w:r>
+        <w:tab/>
+      </w:r>
+      <w:r>
+        <w:rPr>
+          <w:rFonts w:ascii="Times New Roman" w:hAnsi="Times New Roman" w:cs="Times New Roman"/>
+        </w:rPr>
+        <w:t>s</w:t>
+      </w:r>
+      <w:r>
+        <w:rPr>
+          <w:rFonts w:ascii="Times New Roman" w:hAnsi="Times New Roman" w:cs="Times New Roman"/>
+        </w:rPr>
+        <w:t>tatement=”This is my python brush up”</w:t>
+      </w:r>
+    </w:p>
+    <w:p>
+      <w:pPr>
+        <w:pStyle w:val="ListParagraph"/>
+        <w:rPr>
+          <w:rFonts w:ascii="Times New Roman" w:hAnsi="Times New Roman" w:cs="Times New Roman"/>
+        </w:rPr>
+      </w:pPr>
+      <w:r>
+        <w:rPr>
+          <w:rFonts w:ascii="Times New Roman" w:hAnsi="Times New Roman" w:cs="Times New Roman"/>
+        </w:rPr>
+        <w:tab/>
+      </w:r>
+      <w:r>
+        <w:rPr>
+          <w:rFonts w:ascii="Times New Roman" w:hAnsi="Times New Roman" w:cs="Times New Roman"/>
+        </w:rPr>
+        <w:t>Statement.endsWith</w:t>
+      </w:r>
+      <w:r>
+        <w:rPr>
+          <w:rFonts w:ascii="Times New Roman" w:hAnsi="Times New Roman" w:cs="Times New Roman"/>
+        </w:rPr>
+        <w:t>(</w:t>
+      </w:r>
+      <w:r>
+        <w:rPr>
+          <w:rFonts w:ascii="Times New Roman" w:hAnsi="Times New Roman" w:cs="Times New Roman"/>
+        </w:rPr>
+        <w:t>“p”</w:t>
+      </w:r>
+      <w:r>
+        <w:rPr>
+          <w:rFonts w:ascii="Times New Roman" w:hAnsi="Times New Roman" w:cs="Times New Roman"/>
+        </w:rPr>
+        <w:t>)</w:t>
+      </w:r>
+      <w:r>
+        <w:rPr>
+          <w:rFonts w:ascii="Times New Roman" w:hAnsi="Times New Roman" w:cs="Times New Roman"/>
+        </w:rPr>
+        <w:t xml:space="preserve">  it will return true</w:t>
+      </w:r>
+    </w:p>
+    <w:p>
+      <w:pPr>
+        <w:pStyle w:val="ListParagraph"/>
+        <w:numPr>
+          <w:ilvl w:val="0"/>
+          <w:numId w:val="6"/>
+        </w:numPr>
+      </w:pPr>
+      <w:r>
+        <w:t xml:space="preserve">capitalize(): capitalize the first character </w:t>
+      </w:r>
+      <w:r>
+        <w:t>of string.</w:t>
+      </w:r>
+    </w:p>
+    <w:p>
+      <w:pPr>
+        <w:pStyle w:val="ListParagraph"/>
+      </w:pPr>
+      <w:r>
+        <w:t>Example:</w:t>
+      </w:r>
+    </w:p>
+    <w:p>
+      <w:pPr>
+        <w:ind w:left="720"/>
+        <w:rPr>
+          <w:rFonts w:ascii="Times New Roman" w:hAnsi="Times New Roman" w:cs="Times New Roman"/>
+        </w:rPr>
+      </w:pPr>
+      <w:r>
+        <w:tab/>
+      </w:r>
+      <w:r>
+        <w:rPr>
+          <w:rFonts w:ascii="Times New Roman" w:hAnsi="Times New Roman" w:cs="Times New Roman"/>
+        </w:rPr>
+        <w:t>statement=”</w:t>
+      </w:r>
+      <w:r>
+        <w:rPr>
+          <w:rFonts w:ascii="Times New Roman" w:hAnsi="Times New Roman" w:cs="Times New Roman"/>
+        </w:rPr>
+        <w:t>t</w:t>
+      </w:r>
+      <w:r>
+        <w:rPr>
+          <w:rFonts w:ascii="Times New Roman" w:hAnsi="Times New Roman" w:cs="Times New Roman"/>
+        </w:rPr>
+        <w:t>his is my python brush up”</w:t>
+      </w:r>
+    </w:p>
+    <w:p>
+      <w:pPr>
+        <w:ind w:left="720"/>
+        <w:rPr>
+          <w:rFonts w:ascii="Times New Roman" w:hAnsi="Times New Roman" w:cs="Times New Roman"/>
+        </w:rPr>
+      </w:pPr>
+      <w:r>
+        <w:rPr>
+          <w:rFonts w:ascii="Times New Roman" w:hAnsi="Times New Roman" w:cs="Times New Roman"/>
+        </w:rPr>
+        <w:tab/>
+        <w:t>print(statement.capitalize()) this will return ‘this’ to ‘This’</w:t>
+      </w:r>
+    </w:p>
+    <w:p>
+      <w:pPr>
+        <w:pStyle w:val="ListParagraph"/>
+        <w:numPr>
+          <w:ilvl w:val="0"/>
+          <w:numId w:val="6"/>
+        </w:numPr>
+      </w:pPr>
+      <w:r>
+        <w:t>replace(): it will replace the portion of string with specified character or string. It take two input one is string going to be replace and second is string or character that will placed on that given string or character</w:t>
+      </w:r>
+      <w:r>
+        <w:t>.</w:t>
+      </w:r>
+      <w:r>
+        <w:t xml:space="preserve"> This is also case sensitive</w:t>
+      </w:r>
+    </w:p>
+    <w:p>
+      <w:pPr>
+        <w:pStyle w:val="ListParagraph"/>
+      </w:pPr>
+      <w:r>
+        <w:t xml:space="preserve">Example: </w:t>
+      </w:r>
+    </w:p>
+    <w:p>
+      <w:pPr>
+        <w:pStyle w:val="ListParagraph"/>
+      </w:pPr>
+      <w:r>
+        <w:tab/>
+        <w:t>Phrease_1: “This is python tutorial”</w:t>
+      </w:r>
+    </w:p>
+    <w:p>
+      <w:pPr>
+        <w:pStyle w:val="ListParagraph"/>
+      </w:pPr>
+      <w:r>
+        <w:tab/>
+        <w:t>Phrease_1.replace(“i”, “a” )</w:t>
+      </w:r>
+    </w:p>
+    <w:p>
+      <w:pPr>
+        <w:pStyle w:val="ListParagraph"/>
+      </w:pPr>
+    </w:p>
+    <w:p>
+      <w:pPr>
+        <w:pStyle w:val="ListParagraph"/>
+        <w:numPr>
+          <w:ilvl w:val="0"/>
+          <w:numId w:val="6"/>
+        </w:numPr>
+      </w:pPr>
+      <w:r>
+        <w:t>find(): It return 1</w:t>
+      </w:r>
+      <w:r>
+        <w:rPr>
+          <w:vertAlign w:val="superscript"/>
+        </w:rPr>
+        <w:t>st</w:t>
+      </w:r>
+      <w:r>
+        <w:t xml:space="preserve"> index of 1</w:t>
+      </w:r>
+      <w:r>
+        <w:rPr>
+          <w:vertAlign w:val="superscript"/>
+        </w:rPr>
+        <w:t>st</w:t>
+      </w:r>
+      <w:r>
+        <w:t xml:space="preserve"> occrence, it is used to find string.</w:t>
+      </w:r>
+      <w:r>
+        <w:t xml:space="preserve"> It is also case sensitive and it -1 when no </w:t>
+      </w:r>
+      <w:r>
+        <w:t>sub</w:t>
+      </w:r>
+      <w:r>
+        <w:t>string found in given</w:t>
+      </w:r>
+      <w:r>
+        <w:t xml:space="preserve"> string</w:t>
+      </w:r>
+      <w:r>
+        <w:t xml:space="preserve">. </w:t>
+      </w:r>
+    </w:p>
+    <w:p>
+      <w:pPr>
+        <w:pStyle w:val="ListParagraph"/>
+      </w:pPr>
+      <w:r>
+        <w:t>Example:</w:t>
+      </w:r>
+    </w:p>
+    <w:p>
+      <w:pPr>
+        <w:pStyle w:val="ListParagraph"/>
+      </w:pPr>
+      <w:r>
+        <w:tab/>
+        <w:t>Phrease_1 = “I am Tejas from Solapur which from maharashtra”</w:t>
+      </w:r>
+    </w:p>
+    <w:p>
+      <w:pPr>
+        <w:pStyle w:val="ListParagraph"/>
+      </w:pPr>
+      <w:r>
+        <w:tab/>
+        <w:t>Phrease_1.find(“from”)</w:t>
+      </w:r>
+      <w:r>
+        <w:t xml:space="preserve"> – it will return 10 </w:t>
+      </w:r>
+    </w:p>
+    <w:p>
+      <w:pPr>
+        <w:pStyle w:val="ListParagraph"/>
+      </w:pPr>
+    </w:p>
+    <w:p>
+      <w:pPr>
+        <w:pStyle w:val="ListParagraph"/>
+        <w:numPr>
+          <w:ilvl w:val="0"/>
+          <w:numId w:val="6"/>
+        </w:numPr>
+      </w:pPr>
+      <w:r>
+        <w:t>count()</w:t>
+      </w:r>
+      <w:r>
+        <w:t>: count the occurrence of substring inside the string.</w:t>
+      </w:r>
+      <w:r>
+        <w:t xml:space="preserve"> In given string no substring found it returns ‘0’.</w:t>
+      </w:r>
+      <w:r>
+        <w:t xml:space="preserve"> This is also case sensitive.</w:t>
+      </w:r>
+    </w:p>
+    <w:p>
+      <w:pPr>
+        <w:pStyle w:val="ListParagraph"/>
+      </w:pPr>
+      <w:r>
+        <w:t>Example:</w:t>
+      </w:r>
+    </w:p>
+    <w:p>
+      <w:pPr>
+        <w:pStyle w:val="ListParagraph"/>
+      </w:pPr>
+      <w:r>
+        <w:tab/>
+      </w:r>
+      <w:r>
+        <w:t>Phrease_1 = “I am Tejas from Solapur which from maharashtra”</w:t>
+      </w:r>
+    </w:p>
+    <w:p>
+      <w:pPr>
+        <w:pStyle w:val="ListParagraph"/>
+      </w:pPr>
+      <w:r>
+        <w:tab/>
+        <w:t>Phrease_</w:t>
+      </w:r>
+      <w:r>
+        <w:t>1.count</w:t>
+      </w:r>
+      <w:r>
+        <w:t>(“</w:t>
+      </w:r>
+      <w:r>
+        <w:t>a</w:t>
+      </w:r>
+      <w:r>
+        <w:t xml:space="preserve">”) </w:t>
+      </w:r>
+    </w:p>
+    <w:p>
+      <w:pPr>
+        <w:rPr>
+          <w:b/>
+          <w:bCs/>
+        </w:rPr>
+      </w:pPr>
+      <w:r>
+        <w:rPr>
+          <w:b/>
+          <w:bCs/>
+        </w:rPr>
+        <w:lastRenderedPageBreak/>
+        <w:t>Conditional Statement in python</w:t>
+      </w:r>
+    </w:p>
+    <w:p>
+      <w:r>
+        <w:t>Conditional statements are used to execute different blocks of code depending on whether a condition is True or False. Python has four commonly used conditional structures.</w:t>
+      </w:r>
+    </w:p>
+    <w:p>
+      <w:pPr>
+        <w:pStyle w:val="ListParagraph"/>
+        <w:numPr>
+          <w:ilvl w:val="0"/>
+          <w:numId w:val="7"/>
+        </w:numPr>
+        <w:rPr>
+          <w:b/>
+          <w:bCs/>
+        </w:rPr>
+      </w:pPr>
+      <w:r>
+        <w:rPr>
+          <w:b/>
+          <w:bCs/>
+        </w:rPr>
+        <w:t>I</w:t>
+      </w:r>
+      <w:r>
+        <w:rPr>
+          <w:b/>
+          <w:bCs/>
+        </w:rPr>
+        <w:t xml:space="preserve">f: </w:t>
+      </w:r>
+      <w:r>
+        <w:t>It executes the block only when condition is correct or true.</w:t>
+      </w:r>
+      <w:r>
+        <w:t xml:space="preserve"> If the condition is false then skip the intended block.</w:t>
+      </w:r>
+    </w:p>
+    <w:p>
+      <w:pPr>
+        <w:pStyle w:val="ListParagraph"/>
+      </w:pPr>
+      <w:r>
+        <w:t>E</w:t>
+      </w:r>
+      <w:r>
+        <w:t>xample</w:t>
+      </w:r>
+      <w:r>
+        <w:t>:</w:t>
+      </w:r>
+    </w:p>
+    <w:p>
+      <w:pPr>
+        <w:pStyle w:val="ListParagraph"/>
+      </w:pPr>
+      <w:r>
+        <w:tab/>
+        <w:t>age = int(</w:t>
+      </w:r>
+      <w:r>
+        <w:t>inpu</w:t>
+      </w:r>
+      <w:r>
+        <w:t>t(“Enter your age”))</w:t>
+      </w:r>
+    </w:p>
+    <w:p>
+      <w:pPr>
+        <w:pStyle w:val="ListParagraph"/>
+      </w:pPr>
+      <w:r>
+        <w:tab/>
+        <w:t>if(age &gt;= 18):</w:t>
+      </w:r>
+    </w:p>
+    <w:p>
+      <w:pPr>
+        <w:pStyle w:val="ListParagraph"/>
+      </w:pPr>
+      <w:r>
+        <w:tab/>
+      </w:r>
+      <w:r>
+        <w:tab/>
+        <w:t>print(“</w:t>
+      </w:r>
+      <w:r>
+        <w:t>You can drive a bike and car with issued lic</w:t>
+      </w:r>
+      <w:r>
+        <w:t>ens</w:t>
+      </w:r>
+      <w:r>
+        <w:t>e.</w:t>
+      </w:r>
+      <w:r>
         <w:t>”)</w:t>
       </w:r>
     </w:p>
     <w:p>
       <w:pPr>
         <w:pStyle w:val="ListParagraph"/>
-        <w:rPr>
-          <w:rFonts w:ascii="Times New Roman" w:hAnsi="Times New Roman" w:cs="Times New Roman"/>
-        </w:rPr>
-      </w:pPr>
-      <w:r>
-        <w:rPr>
-          <w:rFonts w:ascii="Times New Roman" w:hAnsi="Times New Roman" w:cs="Times New Roman"/>
-        </w:rPr>
-        <w:tab/>
-        <w:t>B = 1.2</w:t>
-      </w:r>
-    </w:p>
-    <w:p>
-      <w:pPr>
-        <w:pStyle w:val="ListParagraph"/>
-        <w:rPr>
-          <w:rFonts w:ascii="Times New Roman" w:hAnsi="Times New Roman" w:cs="Times New Roman"/>
-        </w:rPr>
-      </w:pPr>
-      <w:r>
-        <w:rPr>
-          <w:rFonts w:ascii="Times New Roman" w:hAnsi="Times New Roman" w:cs="Times New Roman"/>
-        </w:rPr>
-        <w:tab/>
-        <w:t>Sum = A + B</w:t>
-      </w:r>
-    </w:p>
-    <w:p>
-      <w:pPr>
-        <w:rPr>
-          <w:rFonts w:ascii="Times New Roman" w:hAnsi="Times New Roman" w:cs="Times New Roman"/>
-          <w:b/>
-          <w:bCs/>
-        </w:rPr>
-      </w:pPr>
-      <w:r>
-        <w:rPr>
-          <w:rFonts w:ascii="Times New Roman" w:hAnsi="Times New Roman" w:cs="Times New Roman"/>
-          <w:b/>
-          <w:bCs/>
-        </w:rPr>
-        <w:t xml:space="preserve">Python User interaction </w:t>
-      </w:r>
-      <w:r>
-        <w:rPr>
-          <w:rFonts w:ascii="Times New Roman" w:hAnsi="Times New Roman" w:cs="Times New Roman"/>
-          <w:b/>
-          <w:bCs/>
-        </w:rPr>
-        <w:t>“</w:t>
-      </w:r>
-      <w:r>
-        <w:rPr>
-          <w:rFonts w:ascii="Times New Roman" w:hAnsi="Times New Roman" w:cs="Times New Roman"/>
-          <w:b/>
-          <w:bCs/>
-        </w:rPr>
-        <w:t xml:space="preserve">Use of </w:t>
+      </w:pPr>
+    </w:p>
+    <w:p>
+      <w:pPr>
+        <w:pStyle w:val="ListParagraph"/>
+        <w:numPr>
+          <w:ilvl w:val="0"/>
+          <w:numId w:val="7"/>
+        </w:numPr>
+        <w:rPr>
+          <w:b/>
+          <w:bCs/>
+        </w:rPr>
+      </w:pPr>
+      <w:r>
+        <w:rPr>
+          <w:b/>
+          <w:bCs/>
+        </w:rPr>
+        <w:t>If_else</w:t>
+      </w:r>
+      <w:r>
+        <w:rPr>
+          <w:b/>
+          <w:bCs/>
+        </w:rPr>
+        <w:t xml:space="preserve">: </w:t>
+      </w:r>
+      <w:r>
+        <w:t>It executes the block only when condition is correct otherwise it executes the else block.</w:t>
+      </w:r>
+    </w:p>
+    <w:p>
+      <w:pPr>
+        <w:pStyle w:val="ListParagraph"/>
+      </w:pPr>
+      <w:r>
+        <w:t>E</w:t>
+      </w:r>
+      <w:r>
+        <w:t>xample</w:t>
+      </w:r>
+      <w:r>
+        <w:t>:</w:t>
+      </w:r>
+    </w:p>
+    <w:p>
+      <w:pPr>
+        <w:pStyle w:val="ListParagraph"/>
+      </w:pPr>
+      <w:r>
+        <w:tab/>
+        <w:t>age = int(</w:t>
+      </w:r>
+      <w:r>
+        <w:t>inpu</w:t>
+      </w:r>
+      <w:r>
+        <w:t>t(“Enter your age”))</w:t>
+      </w:r>
+    </w:p>
+    <w:p>
+      <w:pPr>
+        <w:pStyle w:val="ListParagraph"/>
+      </w:pPr>
+      <w:r>
+        <w:tab/>
+        <w:t>if(age &gt;= 18):</w:t>
+      </w:r>
+    </w:p>
+    <w:p>
+      <w:pPr>
+        <w:pStyle w:val="ListParagraph"/>
+      </w:pPr>
+      <w:r>
+        <w:tab/>
+      </w:r>
+      <w:r>
+        <w:tab/>
+        <w:t>print(“You can drive a bike and car with issued lic</w:t>
+      </w:r>
+      <w:r>
+        <w:t>ens</w:t>
+      </w:r>
+      <w:r>
+        <w:t>e.”)</w:t>
+      </w:r>
+    </w:p>
+    <w:p>
+      <w:pPr>
+        <w:pStyle w:val="ListParagraph"/>
+      </w:pPr>
+      <w:r>
+        <w:tab/>
+        <w:t>else:</w:t>
+      </w:r>
+    </w:p>
+    <w:p>
+      <w:pPr>
+        <w:pStyle w:val="ListParagraph"/>
+      </w:pPr>
+      <w:r>
+        <w:tab/>
+      </w:r>
+      <w:r>
+        <w:tab/>
+        <w:t>print(“</w:t>
+      </w:r>
+      <w:r>
+        <w:t>You can</w:t>
+      </w:r>
+      <w:r>
+        <w:t>not</w:t>
+      </w:r>
+      <w:r>
+        <w:t xml:space="preserve"> drive a bike and car with</w:t>
+      </w:r>
+      <w:r>
+        <w:t>out issuing</w:t>
+      </w:r>
+      <w:r>
+        <w:t xml:space="preserve"> lic</w:t>
+      </w:r>
+      <w:r>
+        <w:t>ens</w:t>
+      </w:r>
+      <w:r>
+        <w:t>e.</w:t>
+      </w:r>
+      <w:r>
+        <w:t>”)</w:t>
+      </w:r>
+    </w:p>
+    <w:p>
+      <w:pPr>
+        <w:pStyle w:val="ListParagraph"/>
+      </w:pPr>
+    </w:p>
+    <w:p>
+      <w:pPr>
+        <w:pStyle w:val="ListParagraph"/>
+        <w:numPr>
+          <w:ilvl w:val="0"/>
+          <w:numId w:val="7"/>
+        </w:numPr>
+        <w:rPr>
+          <w:b/>
+          <w:bCs/>
+        </w:rPr>
+      </w:pPr>
+      <w:r>
+        <w:rPr>
+          <w:b/>
+          <w:bCs/>
+        </w:rPr>
+        <w:t>if-elif-else:</w:t>
+      </w:r>
+      <w:r>
+        <w:rPr>
+          <w:b/>
+          <w:bCs/>
+        </w:rPr>
+        <w:t xml:space="preserve"> </w:t>
+      </w:r>
+      <w:r>
+        <w:t>It is used when you have multiple condition to check.</w:t>
+      </w:r>
+    </w:p>
+    <w:p>
+      <w:pPr>
+        <w:pStyle w:val="ListParagraph"/>
+        <w:numPr>
+          <w:ilvl w:val="1"/>
+          <w:numId w:val="7"/>
+        </w:numPr>
+      </w:pPr>
+      <w:r>
+        <w:rPr>
+          <w:b/>
+          <w:bCs/>
+        </w:rPr>
+        <w:t xml:space="preserve">if: </w:t>
+      </w:r>
+      <w:r>
+        <w:t xml:space="preserve">check first condition if it </w:t>
+      </w:r>
+      <w:r>
+        <w:t>is true then it executes the intended block and returns.</w:t>
+      </w:r>
+    </w:p>
+    <w:p>
+      <w:pPr>
+        <w:pStyle w:val="ListParagraph"/>
+        <w:numPr>
+          <w:ilvl w:val="1"/>
+          <w:numId w:val="7"/>
+        </w:numPr>
+      </w:pPr>
+      <w:r>
+        <w:rPr>
+          <w:b/>
+          <w:bCs/>
+        </w:rPr>
+        <w:t xml:space="preserve">elif: </w:t>
+      </w:r>
+      <w:r>
+        <w:t>from given condition first condition got failed then it check the condition and condition is true it execute the intended block</w:t>
+      </w:r>
+      <w:r>
+        <w:t xml:space="preserve"> and returns</w:t>
+      </w:r>
+      <w:r>
+        <w:t>.</w:t>
+      </w:r>
+    </w:p>
+    <w:p>
+      <w:pPr>
+        <w:pStyle w:val="ListParagraph"/>
+        <w:numPr>
+          <w:ilvl w:val="1"/>
+          <w:numId w:val="7"/>
+        </w:numPr>
+      </w:pPr>
+      <w:r>
+        <w:rPr>
+          <w:b/>
+          <w:bCs/>
+        </w:rPr>
+        <w:t>else:</w:t>
+      </w:r>
+      <w:r>
+        <w:t xml:space="preserve"> from given conditions all conditions are got failed then it executes the else block and returns.</w:t>
+      </w:r>
+    </w:p>
+    <w:p>
+      <w:pPr>
+        <w:ind w:left="1080"/>
+      </w:pPr>
+      <w:r>
+        <w:t>Example:</w:t>
+      </w:r>
+    </w:p>
+    <w:p>
+      <w:pPr>
+        <w:ind w:left="1080" w:firstLine="360"/>
+      </w:pPr>
+      <w:r>
+        <w:t>percentage= int(input("Enter you percentae \t"))</w:t>
+      </w:r>
+    </w:p>
+    <w:p>
+      <w:pPr>
+        <w:ind w:left="1080" w:firstLine="360"/>
+      </w:pPr>
+      <w:r>
+        <w:t>if(percentage &gt; 80):</w:t>
+      </w:r>
+    </w:p>
+    <w:p>
+      <w:pPr>
+        <w:ind w:left="1800" w:firstLine="360"/>
+      </w:pPr>
+      <w:r>
+        <w:t>print("Grade A")</w:t>
+      </w:r>
+    </w:p>
+    <w:p>
+      <w:pPr>
+        <w:ind w:left="720" w:firstLine="720"/>
+      </w:pPr>
+      <w:r>
+        <w:t>elif(percentage &gt; 60):</w:t>
+      </w:r>
+    </w:p>
+    <w:p>
+      <w:pPr>
+        <w:ind w:left="1440" w:firstLine="720"/>
+      </w:pPr>
+      <w:r>
+        <w:t>print("Grade B")</w:t>
+      </w:r>
+    </w:p>
+    <w:p>
+      <w:pPr>
+        <w:ind w:left="1080" w:firstLine="360"/>
+      </w:pPr>
+      <w:r>
+        <w:t>elif(percentage &gt; 45):</w:t>
+      </w:r>
+    </w:p>
+    <w:p>
+      <w:pPr>
+        <w:ind w:left="1800" w:firstLine="360"/>
+      </w:pPr>
+      <w:r>
+        <w:lastRenderedPageBreak/>
+        <w:t xml:space="preserve">  print("Grade C")</w:t>
+      </w:r>
+    </w:p>
+    <w:p>
+      <w:pPr>
+        <w:ind w:left="720" w:firstLine="720"/>
+      </w:pPr>
+      <w:r>
+        <w:t>else:</w:t>
+      </w:r>
+    </w:p>
+    <w:p>
+      <w:pPr>
+        <w:ind w:left="1440" w:firstLine="720"/>
+      </w:pPr>
+      <w:r>
+        <w:t xml:space="preserve">  print("You are failed in your class....!")</w:t>
+      </w:r>
+      <w:r>
+        <w:tab/>
+      </w:r>
+    </w:p>
+    <w:p>
+      <w:pPr>
+        <w:pStyle w:val="ListParagraph"/>
+        <w:numPr>
+          <w:ilvl w:val="0"/>
+          <w:numId w:val="7"/>
+        </w:numPr>
+        <w:rPr>
+          <w:b/>
+          <w:bCs/>
+        </w:rPr>
+      </w:pPr>
+      <w:r>
+        <w:rPr>
+          <w:b/>
+          <w:bCs/>
+        </w:rPr>
+        <w:t>Nested if_else</w:t>
+      </w:r>
+      <w:r>
+        <w:rPr>
+          <w:b/>
+          <w:bCs/>
+        </w:rPr>
+        <w:t xml:space="preserve">: </w:t>
+      </w:r>
+      <w:r>
+        <w:t>An if statement inside if</w:t>
+      </w:r>
+      <w:r>
+        <w:t>_else</w:t>
+      </w:r>
+      <w:r>
+        <w:t xml:space="preserve"> statement is called nested if_else.</w:t>
+      </w:r>
+    </w:p>
+    <w:p>
+      <w:pPr>
+        <w:pStyle w:val="ListParagraph"/>
+      </w:pPr>
+      <w:r>
+        <w:t>Example:</w:t>
+      </w:r>
+    </w:p>
+    <w:p>
+      <w:pPr>
+        <w:pStyle w:val="ListParagraph"/>
+      </w:pPr>
+      <w:r>
+        <w:tab/>
+      </w:r>
+      <w:r>
+        <w:t>age = int(input("Enter your age"))</w:t>
+      </w:r>
+    </w:p>
+    <w:p>
+      <w:pPr>
+        <w:pStyle w:val="ListParagraph"/>
+        <w:ind w:firstLine="720"/>
+      </w:pPr>
+      <w:r>
+        <w:t>if(age &gt;= 18):</w:t>
+      </w:r>
+    </w:p>
+    <w:p>
+      <w:pPr>
+        <w:pStyle w:val="ListParagraph"/>
+        <w:ind w:left="1440" w:firstLine="720"/>
+      </w:pPr>
+      <w:r>
+        <w:t>license = input("Do you have driving license ?")</w:t>
+      </w:r>
+    </w:p>
+    <w:p>
+      <w:pPr>
+        <w:ind w:left="1440" w:firstLine="720"/>
+      </w:pPr>
+      <w:r>
+        <w:t>if(license == "Yes" or license == 'yes' or license == 'y' or license == 'Y'):</w:t>
+      </w:r>
+    </w:p>
+    <w:p>
+      <w:pPr>
+        <w:pStyle w:val="ListParagraph"/>
+        <w:ind w:left="1440" w:firstLine="720"/>
+      </w:pPr>
+      <w:r>
+        <w:t xml:space="preserve">      print("You can drive a bike and car with issued license.")</w:t>
+      </w:r>
+    </w:p>
+    <w:p>
+      <w:pPr>
+        <w:pStyle w:val="ListParagraph"/>
+        <w:ind w:left="1440" w:firstLine="720"/>
+      </w:pPr>
+      <w:r>
+        <w:t>else:</w:t>
+      </w:r>
+    </w:p>
+    <w:p>
+      <w:pPr>
+        <w:pStyle w:val="ListParagraph"/>
+        <w:ind w:left="2490"/>
+      </w:pPr>
+      <w:r>
+        <w:t>print("You are old enough to ride bike and drive car but you don't hold driving license so you can't ride or drive.")</w:t>
+      </w:r>
+    </w:p>
+    <w:p>
+      <w:pPr>
+        <w:pStyle w:val="ListParagraph"/>
+        <w:ind w:firstLine="720"/>
+      </w:pPr>
+      <w:r>
+        <w:t>else:</w:t>
+      </w:r>
+    </w:p>
+    <w:p>
+      <w:pPr>
+        <w:ind w:left="1440" w:firstLine="720"/>
+      </w:pPr>
+      <w:r>
+        <w:t>print("You cannot drive a bike and car without issuing license.")</w:t>
+      </w:r>
+    </w:p>
+    <w:p>
+      <w:pPr>
+        <w:rPr>
+          <w:b/>
+          <w:bCs/>
+        </w:rPr>
+      </w:pPr>
+      <w:r>
+        <w:rPr>
+          <w:b/>
+          <w:bCs/>
+        </w:rPr>
+        <w:t>Lecture 3</w:t>
+      </w:r>
+      <w:r>
+        <w:rPr>
+          <w:b/>
+          <w:bCs/>
+        </w:rPr>
+        <w:t xml:space="preserve">: </w:t>
+      </w:r>
+    </w:p>
+    <w:p>
+      <w:pPr>
+        <w:rPr>
+          <w:b/>
+          <w:bCs/>
+        </w:rPr>
+      </w:pPr>
+      <w:r>
+        <w:rPr>
+          <w:b/>
+          <w:bCs/>
+        </w:rPr>
+        <w:t>Tuples and List</w:t>
+      </w:r>
+    </w:p>
+    <w:p>
+      <w:pPr>
+        <w:pStyle w:val="ListParagraph"/>
+        <w:numPr>
+          <w:ilvl w:val="0"/>
+          <w:numId w:val="8"/>
+        </w:numPr>
+        <w:rPr>
+          <w:b/>
+          <w:bCs/>
+        </w:rPr>
+      </w:pPr>
+      <w:r>
+        <w:rPr>
+          <w:b/>
+          <w:bCs/>
+        </w:rPr>
+        <w:t xml:space="preserve">List: </w:t>
+      </w:r>
+      <w:r>
+        <w:t>List is a build in data type that store the set of values in single variable, you can store different datatypes in the same list. List allows you to access individual elements.</w:t>
+      </w:r>
+      <w:r>
+        <w:rPr>
+          <w:b/>
+          <w:bCs/>
+        </w:rPr>
+        <w:t xml:space="preserve">  </w:t>
+      </w:r>
+      <w:r>
+        <w:t>Most important list are mutable that you can add remove and modify any element of list.</w:t>
+      </w:r>
+    </w:p>
+    <w:p>
+      <w:pPr>
+        <w:pStyle w:val="ListParagraph"/>
+        <w:rPr>
+          <w:b/>
+          <w:bCs/>
+        </w:rPr>
+      </w:pPr>
+    </w:p>
+    <w:p>
+      <w:pPr>
+        <w:pStyle w:val="ListParagraph"/>
+        <w:rPr>
+          <w:b/>
+          <w:bCs/>
+        </w:rPr>
+      </w:pPr>
+      <w:r>
+        <w:rPr>
+          <w:b/>
+          <w:bCs/>
+        </w:rPr>
+        <w:t>Operation on list</w:t>
+      </w:r>
+    </w:p>
+    <w:p>
+      <w:pPr>
+        <w:pStyle w:val="ListParagraph"/>
+        <w:numPr>
+          <w:ilvl w:val="0"/>
+          <w:numId w:val="9"/>
+        </w:numPr>
+        <w:rPr>
+          <w:b/>
+          <w:bCs/>
+        </w:rPr>
+      </w:pPr>
+      <w:r>
+        <w:rPr>
+          <w:b/>
+          <w:bCs/>
+        </w:rPr>
+        <w:t xml:space="preserve">Accessing list elements by index: </w:t>
+      </w:r>
+      <w:r>
+        <w:t>python list use zero-</w:t>
+      </w:r>
+      <w:r>
+        <w:t>based indexing just like strings.</w:t>
+      </w:r>
+    </w:p>
+    <w:p>
+      <w:pPr>
+        <w:pStyle w:val="ListParagraph"/>
+        <w:ind w:left="1800"/>
+      </w:pPr>
+      <w:r>
+        <w:t>Example</w:t>
+      </w:r>
+      <w:r>
+        <w:t xml:space="preserve">: </w:t>
+      </w:r>
+    </w:p>
+    <w:p>
+      <w:pPr>
+        <w:pStyle w:val="ListParagraph"/>
+        <w:ind w:left="1800"/>
+      </w:pPr>
+      <w:r>
+        <w:tab/>
+        <w:t>marks=[70,50]</w:t>
+      </w:r>
+    </w:p>
+    <w:p>
+      <w:pPr>
+        <w:pStyle w:val="ListParagraph"/>
+        <w:ind w:left="1800"/>
+      </w:pPr>
+      <w:r>
+        <w:tab/>
+        <w:t>Print(marks[0]) this will print 70 cause it index is 0</w:t>
+      </w:r>
+    </w:p>
+    <w:p>
+      <w:pPr>
+        <w:pStyle w:val="ListParagraph"/>
+        <w:ind w:left="1800"/>
+      </w:pPr>
+    </w:p>
+    <w:p>
+      <w:pPr>
+        <w:pStyle w:val="ListParagraph"/>
+        <w:numPr>
+          <w:ilvl w:val="0"/>
+          <w:numId w:val="9"/>
+        </w:numPr>
+        <w:rPr>
+          <w:b/>
+          <w:bCs/>
+        </w:rPr>
+      </w:pPr>
+      <w:r>
+        <w:rPr>
+          <w:b/>
+          <w:bCs/>
+        </w:rPr>
+        <w:t xml:space="preserve">Slicing List: </w:t>
+      </w:r>
+      <w:r>
+        <w:t xml:space="preserve">slicing is used extract </w:t>
+      </w:r>
+      <w:r>
+        <w:t xml:space="preserve">a portion a sequence, such as a string, list or tuple. In simple word, slicing allows you to get multiple elements from a collection without accessing each element individually. </w:t>
+      </w:r>
+    </w:p>
+    <w:p>
+      <w:pPr>
+        <w:pStyle w:val="ListParagraph"/>
+        <w:ind w:left="1800"/>
+      </w:pPr>
+      <w:r>
+        <w:t>Syntax</w:t>
+      </w:r>
+      <w:r>
+        <w:t>:</w:t>
+      </w:r>
+    </w:p>
+    <w:p>
+      <w:pPr>
+        <w:pStyle w:val="ListParagraph"/>
+        <w:ind w:left="1800"/>
+      </w:pPr>
+      <w:r>
+        <w:tab/>
+        <w:t>List[start : end : step]</w:t>
+      </w:r>
+    </w:p>
+    <w:p>
+      <w:pPr>
+        <w:pStyle w:val="ListParagraph"/>
+        <w:ind w:left="1800"/>
+      </w:pPr>
+      <w:r>
+        <w:lastRenderedPageBreak/>
+        <w:t>Example:</w:t>
+      </w:r>
+    </w:p>
+    <w:p>
+      <w:pPr>
+        <w:pStyle w:val="ListParagraph"/>
+        <w:ind w:left="1800"/>
+      </w:pPr>
+      <w:r>
+        <w:tab/>
+        <w:t>marks = [“Python”, 50, 60, 70, 80, 90, “Tejas”]</w:t>
+      </w:r>
+      <w:r>
+        <w:t xml:space="preserve"> </w:t>
+      </w:r>
+    </w:p>
+    <w:p>
+      <w:pPr>
+        <w:pStyle w:val="ListParagraph"/>
+        <w:ind w:left="1800"/>
+      </w:pPr>
+      <w:r>
+        <w:tab/>
+        <w:t>Print(marks[2 : len(marks)-2] : 2</w:t>
       </w:r>
       <w:bookmarkStart w:id="0" w:name="_GoBack"/>
       <w:bookmarkEnd w:id="0"/>
       <w:r>
-        <w:rPr>
-          <w:rFonts w:ascii="Times New Roman" w:hAnsi="Times New Roman" w:cs="Times New Roman"/>
-          <w:b/>
-          <w:bCs/>
-        </w:rPr>
-        <w:t>Input()”</w:t>
-      </w:r>
-    </w:p>
-    <w:p>
-      <w:pPr>
-        <w:rPr>
-          <w:rFonts w:ascii="Times New Roman" w:hAnsi="Times New Roman" w:cs="Times New Roman"/>
-        </w:rPr>
-      </w:pPr>
-      <w:r>
-        <w:rPr>
-          <w:rFonts w:ascii="Times New Roman" w:hAnsi="Times New Roman" w:cs="Times New Roman"/>
-        </w:rPr>
-        <w:t xml:space="preserve">Input(): this is function </w:t>
-      </w:r>
-      <w:r>
-        <w:rPr>
-          <w:rFonts w:ascii="Times New Roman" w:hAnsi="Times New Roman" w:cs="Times New Roman"/>
-        </w:rPr>
-        <w:t>is used to accept data from the user</w:t>
-      </w:r>
-      <w:r>
-        <w:rPr>
-          <w:rFonts w:ascii="Times New Roman" w:hAnsi="Times New Roman" w:cs="Times New Roman"/>
-        </w:rPr>
-        <w:t xml:space="preserve"> at run time of program, we also can put some string or value inside that input to show message </w:t>
-      </w:r>
-      <w:r>
-        <w:rPr>
-          <w:rFonts w:ascii="Times New Roman" w:hAnsi="Times New Roman" w:cs="Times New Roman"/>
-        </w:rPr>
-        <w:t>to user, also we can save the value of user entered into variable. It result is always a string, we need to use type casting to convert the value into ap</w:t>
-      </w:r>
-      <w:r>
-        <w:rPr>
-          <w:rFonts w:ascii="Times New Roman" w:hAnsi="Times New Roman" w:cs="Times New Roman"/>
-        </w:rPr>
-        <w:t>propriate type user want.</w:t>
-      </w:r>
-    </w:p>
-    <w:p>
-      <w:pPr>
-        <w:rPr>
-          <w:rFonts w:ascii="Times New Roman" w:hAnsi="Times New Roman" w:cs="Times New Roman"/>
-        </w:rPr>
-      </w:pPr>
-      <w:r>
-        <w:rPr>
-          <w:rFonts w:ascii="Times New Roman" w:hAnsi="Times New Roman" w:cs="Times New Roman"/>
-        </w:rPr>
-        <w:t>Example:</w:t>
-      </w:r>
-      <w:r>
-        <w:rPr>
-          <w:rFonts w:ascii="Times New Roman" w:hAnsi="Times New Roman" w:cs="Times New Roman"/>
-        </w:rPr>
-        <w:tab/>
-      </w:r>
-    </w:p>
-    <w:p>
-      <w:pPr>
-        <w:rPr>
-          <w:rFonts w:ascii="Times New Roman" w:hAnsi="Times New Roman" w:cs="Times New Roman"/>
-        </w:rPr>
-      </w:pPr>
-      <w:r>
-        <w:rPr>
-          <w:rFonts w:ascii="Times New Roman" w:hAnsi="Times New Roman" w:cs="Times New Roman"/>
-        </w:rPr>
-        <w:tab/>
-      </w:r>
-      <w:proofErr w:type="gramStart"/>
-      <w:r>
-        <w:rPr>
-          <w:rFonts w:ascii="Times New Roman" w:hAnsi="Times New Roman" w:cs="Times New Roman"/>
-        </w:rPr>
-        <w:t>name</w:t>
-      </w:r>
-      <w:proofErr w:type="gramEnd"/>
-      <w:r>
-        <w:rPr>
-          <w:rFonts w:ascii="Times New Roman" w:hAnsi="Times New Roman" w:cs="Times New Roman"/>
-        </w:rPr>
-        <w:t xml:space="preserve"> = input(“Enter User Name”)</w:t>
-      </w:r>
-    </w:p>
-    <w:p>
-      <w:pPr>
-        <w:rPr>
-          <w:rFonts w:ascii="Times New Roman" w:hAnsi="Times New Roman" w:cs="Times New Roman"/>
-        </w:rPr>
-      </w:pPr>
-      <w:proofErr w:type="gramStart"/>
-      <w:r>
-        <w:rPr>
-          <w:rFonts w:ascii="Times New Roman" w:hAnsi="Times New Roman" w:cs="Times New Roman"/>
-        </w:rPr>
-        <w:t>Input(</w:t>
-      </w:r>
-      <w:proofErr w:type="gramEnd"/>
-      <w:r>
-        <w:rPr>
-          <w:rFonts w:ascii="Times New Roman" w:hAnsi="Times New Roman" w:cs="Times New Roman"/>
-        </w:rPr>
-        <w:t>) with type casting from string result to another</w:t>
-      </w:r>
-      <w:r>
-        <w:rPr>
-          <w:rFonts w:ascii="Times New Roman" w:hAnsi="Times New Roman" w:cs="Times New Roman"/>
-        </w:rPr>
-        <w:t xml:space="preserve"> data type at the time of accepting input from user.</w:t>
-      </w:r>
-      <w:r>
-        <w:rPr>
-          <w:rFonts w:ascii="Times New Roman" w:hAnsi="Times New Roman" w:cs="Times New Roman"/>
-        </w:rPr>
-        <w:t xml:space="preserve"> </w:t>
-      </w:r>
-    </w:p>
-    <w:p>
-      <w:pPr>
-        <w:rPr>
-          <w:rFonts w:ascii="Times New Roman" w:hAnsi="Times New Roman" w:cs="Times New Roman"/>
-        </w:rPr>
-      </w:pPr>
-      <w:r>
-        <w:rPr>
-          <w:rFonts w:ascii="Times New Roman" w:hAnsi="Times New Roman" w:cs="Times New Roman"/>
-        </w:rPr>
-        <w:t xml:space="preserve">Example: </w:t>
-      </w:r>
-    </w:p>
-    <w:p>
-      <w:pPr>
-        <w:ind w:firstLine="720"/>
-        <w:rPr>
-          <w:rFonts w:ascii="Times New Roman" w:hAnsi="Times New Roman" w:cs="Times New Roman"/>
-        </w:rPr>
-      </w:pPr>
-      <w:r>
-        <w:rPr>
-          <w:rFonts w:ascii="Times New Roman" w:hAnsi="Times New Roman" w:cs="Times New Roman"/>
-        </w:rPr>
-        <w:t xml:space="preserve">Age = </w:t>
-      </w:r>
-      <w:proofErr w:type="spellStart"/>
-      <w:proofErr w:type="gramStart"/>
-      <w:r>
-        <w:rPr>
-          <w:rFonts w:ascii="Times New Roman" w:hAnsi="Times New Roman" w:cs="Times New Roman"/>
-        </w:rPr>
-        <w:t>int</w:t>
-      </w:r>
-      <w:proofErr w:type="spellEnd"/>
-      <w:r>
-        <w:rPr>
-          <w:rFonts w:ascii="Times New Roman" w:hAnsi="Times New Roman" w:cs="Times New Roman"/>
-        </w:rPr>
-        <w:t>(</w:t>
-      </w:r>
-      <w:proofErr w:type="gramEnd"/>
-      <w:r>
-        <w:rPr>
-          <w:rFonts w:ascii="Times New Roman" w:hAnsi="Times New Roman" w:cs="Times New Roman"/>
-        </w:rPr>
-        <w:t>input(“Enter Your Age”))</w:t>
-      </w:r>
-    </w:p>
-    <w:p>
-      <w:pPr>
-        <w:ind w:firstLine="720"/>
-        <w:rPr>
-          <w:rFonts w:ascii="Times New Roman" w:hAnsi="Times New Roman" w:cs="Times New Roman"/>
-        </w:rPr>
-      </w:pPr>
-      <w:r>
-        <w:rPr>
-          <w:rFonts w:ascii="Times New Roman" w:hAnsi="Times New Roman" w:cs="Times New Roman"/>
-        </w:rPr>
-        <w:t xml:space="preserve">Price = </w:t>
-      </w:r>
-      <w:proofErr w:type="gramStart"/>
-      <w:r>
-        <w:rPr>
-          <w:rFonts w:ascii="Times New Roman" w:hAnsi="Times New Roman" w:cs="Times New Roman"/>
-        </w:rPr>
-        <w:t>float(</w:t>
-      </w:r>
-      <w:proofErr w:type="gramEnd"/>
-      <w:r>
-        <w:rPr>
-          <w:rFonts w:ascii="Times New Roman" w:hAnsi="Times New Roman" w:cs="Times New Roman"/>
-        </w:rPr>
-        <w:t>input(“Enter Price”))</w:t>
-      </w:r>
-    </w:p>
-    <w:p>
-      <w:pPr>
-        <w:rPr>
-          <w:rFonts w:ascii="Times New Roman" w:hAnsi="Times New Roman" w:cs="Times New Roman"/>
-          <w:b/>
-          <w:bCs/>
-        </w:rPr>
-      </w:pPr>
-      <w:r>
-        <w:rPr>
-          <w:rFonts w:ascii="Times New Roman" w:hAnsi="Times New Roman" w:cs="Times New Roman"/>
-          <w:b/>
-          <w:bCs/>
-        </w:rPr>
-        <w:lastRenderedPageBreak/>
-        <w:t>Day 2</w:t>
-      </w:r>
-      <w:r>
-        <w:rPr>
-          <w:rFonts w:ascii="Times New Roman" w:hAnsi="Times New Roman" w:cs="Times New Roman"/>
-          <w:b/>
-          <w:bCs/>
-        </w:rPr>
-        <w:t xml:space="preserve">: </w:t>
-      </w:r>
-    </w:p>
-    <w:p>
-      <w:pPr>
-        <w:rPr>
-          <w:rFonts w:ascii="Times New Roman" w:hAnsi="Times New Roman" w:cs="Times New Roman"/>
-          <w:b/>
-          <w:bCs/>
-        </w:rPr>
+        <w:t>)</w:t>
+      </w:r>
+    </w:p>
+    <w:p>
+      <w:pPr>
+        <w:pStyle w:val="ListParagraph"/>
+        <w:ind w:left="1800"/>
       </w:pPr>
     </w:p>
     <w:sectPr>
@@ -1666,9 +3010,148 @@
 </w:document>
 </file>
 
+<file path=word/endnotes.xml><?xml version="1.0" encoding="utf-8"?>
+<w:endnotes xmlns:wpc="http://schemas.microsoft.com/office/word/2010/wordprocessingCanvas" xmlns:cx="http://schemas.microsoft.com/office/drawing/2014/chartex" xmlns:cx1="http://schemas.microsoft.com/office/drawing/2015/9/8/chartex" xmlns:mc="http://schemas.openxmlformats.org/markup-compatibility/2006" xmlns:o="urn:schemas-microsoft-com:office:office" xmlns:r="http://schemas.openxmlformats.org/officeDocument/2006/relationships" xmlns:m="http://schemas.openxmlformats.org/officeDocument/2006/math" xmlns:v="urn:schemas-microsoft-com:vml" xmlns:wp14="http://schemas.microsoft.com/office/word/2010/wordprocessingDrawing" xmlns:wp="http://schemas.openxmlformats.org/drawingml/2006/wordprocessingDrawing" xmlns:w10="urn:schemas-microsoft-com:office:word" xmlns:w="http://schemas.openxmlformats.org/wordprocessingml/2006/main" xmlns:w14="http://schemas.microsoft.com/office/word/2010/wordml" xmlns:w15="http://schemas.microsoft.com/office/word/2012/wordml" xmlns:w16se="http://schemas.microsoft.com/office/word/2015/wordml/symex" xmlns:wpg="http://schemas.microsoft.com/office/word/2010/wordprocessingGroup" xmlns:wpi="http://schemas.microsoft.com/office/word/2010/wordprocessingInk" xmlns:wne="http://schemas.microsoft.com/office/word/2006/wordml" xmlns:wps="http://schemas.microsoft.com/office/word/2010/wordprocessingShape" mc:Ignorable="w14 w15 w16se wp14">
+  <w:endnote w:type="separator" w:id="-1">
+    <w:p>
+      <w:pPr>
+        <w:spacing w:after="0" w:line="240" w:lineRule="auto"/>
+      </w:pPr>
+      <w:r>
+        <w:separator/>
+      </w:r>
+    </w:p>
+  </w:endnote>
+  <w:endnote w:type="continuationSeparator" w:id="0">
+    <w:p>
+      <w:pPr>
+        <w:spacing w:after="0" w:line="240" w:lineRule="auto"/>
+      </w:pPr>
+      <w:r>
+        <w:continuationSeparator/>
+      </w:r>
+    </w:p>
+  </w:endnote>
+</w:endnotes>
+</file>
+
+<file path=word/footnotes.xml><?xml version="1.0" encoding="utf-8"?>
+<w:footnotes xmlns:wpc="http://schemas.microsoft.com/office/word/2010/wordprocessingCanvas" xmlns:cx="http://schemas.microsoft.com/office/drawing/2014/chartex" xmlns:cx1="http://schemas.microsoft.com/office/drawing/2015/9/8/chartex" xmlns:mc="http://schemas.openxmlformats.org/markup-compatibility/2006" xmlns:o="urn:schemas-microsoft-com:office:office" xmlns:r="http://schemas.openxmlformats.org/officeDocument/2006/relationships" xmlns:m="http://schemas.openxmlformats.org/officeDocument/2006/math" xmlns:v="urn:schemas-microsoft-com:vml" xmlns:wp14="http://schemas.microsoft.com/office/word/2010/wordprocessingDrawing" xmlns:wp="http://schemas.openxmlformats.org/drawingml/2006/wordprocessingDrawing" xmlns:w10="urn:schemas-microsoft-com:office:word" xmlns:w="http://schemas.openxmlformats.org/wordprocessingml/2006/main" xmlns:w14="http://schemas.microsoft.com/office/word/2010/wordml" xmlns:w15="http://schemas.microsoft.com/office/word/2012/wordml" xmlns:w16se="http://schemas.microsoft.com/office/word/2015/wordml/symex" xmlns:wpg="http://schemas.microsoft.com/office/word/2010/wordprocessingGroup" xmlns:wpi="http://schemas.microsoft.com/office/word/2010/wordprocessingInk" xmlns:wne="http://schemas.microsoft.com/office/word/2006/wordml" xmlns:wps="http://schemas.microsoft.com/office/word/2010/wordprocessingShape" mc:Ignorable="w14 w15 w16se wp14">
+  <w:footnote w:type="separator" w:id="-1">
+    <w:p>
+      <w:pPr>
+        <w:spacing w:after="0" w:line="240" w:lineRule="auto"/>
+      </w:pPr>
+      <w:r>
+        <w:separator/>
+      </w:r>
+    </w:p>
+  </w:footnote>
+  <w:footnote w:type="continuationSeparator" w:id="0">
+    <w:p>
+      <w:pPr>
+        <w:spacing w:after="0" w:line="240" w:lineRule="auto"/>
+      </w:pPr>
+      <w:r>
+        <w:continuationSeparator/>
+      </w:r>
+    </w:p>
+  </w:footnote>
+</w:footnotes>
+</file>
+
 <file path=word/numbering.xml><?xml version="1.0" encoding="utf-8"?>
 <w:numbering xmlns:wpc="http://schemas.microsoft.com/office/word/2010/wordprocessingCanvas" xmlns:cx="http://schemas.microsoft.com/office/drawing/2014/chartex" xmlns:cx1="http://schemas.microsoft.com/office/drawing/2015/9/8/chartex" xmlns:mc="http://schemas.openxmlformats.org/markup-compatibility/2006" xmlns:o="urn:schemas-microsoft-com:office:office" xmlns:r="http://schemas.openxmlformats.org/officeDocument/2006/relationships" xmlns:m="http://schemas.openxmlformats.org/officeDocument/2006/math" xmlns:v="urn:schemas-microsoft-com:vml" xmlns:wp14="http://schemas.microsoft.com/office/word/2010/wordprocessingDrawing" xmlns:wp="http://schemas.openxmlformats.org/drawingml/2006/wordprocessingDrawing" xmlns:w10="urn:schemas-microsoft-com:office:word" xmlns:w="http://schemas.openxmlformats.org/wordprocessingml/2006/main" xmlns:w14="http://schemas.microsoft.com/office/word/2010/wordml" xmlns:w15="http://schemas.microsoft.com/office/word/2012/wordml" xmlns:w16se="http://schemas.microsoft.com/office/word/2015/wordml/symex" xmlns:wpg="http://schemas.microsoft.com/office/word/2010/wordprocessingGroup" xmlns:wpi="http://schemas.microsoft.com/office/word/2010/wordprocessingInk" xmlns:wne="http://schemas.microsoft.com/office/word/2006/wordml" xmlns:wps="http://schemas.microsoft.com/office/word/2010/wordprocessingShape" mc:Ignorable="w14 w15 w16se wp14">
   <w:abstractNum w:abstractNumId="0" w15:restartNumberingAfterBreak="0">
+    <w:nsid w:val="017F1A36"/>
+    <w:multiLevelType w:val="hybridMultilevel"/>
+    <w:tmpl w:val="961E8A4A"/>
+    <w:lvl w:ilvl="0" w:tplc="04090011">
+      <w:start w:val="1"/>
+      <w:numFmt w:val="decimal"/>
+      <w:lvlText w:val="%1)"/>
+      <w:lvlJc w:val="left"/>
+      <w:pPr>
+        <w:ind w:left="720" w:hanging="360"/>
+      </w:pPr>
+      <w:rPr>
+        <w:rFonts w:hint="default"/>
+      </w:rPr>
+    </w:lvl>
+    <w:lvl w:ilvl="1" w:tplc="04090019">
+      <w:start w:val="1"/>
+      <w:numFmt w:val="lowerLetter"/>
+      <w:lvlText w:val="%2."/>
+      <w:lvlJc w:val="left"/>
+      <w:pPr>
+        <w:ind w:left="1440" w:hanging="360"/>
+      </w:pPr>
+    </w:lvl>
+    <w:lvl w:ilvl="2" w:tplc="0409001B">
+      <w:start w:val="1"/>
+      <w:numFmt w:val="lowerRoman"/>
+      <w:lvlText w:val="%3."/>
+      <w:lvlJc w:val="right"/>
+      <w:pPr>
+        <w:ind w:left="2160" w:hanging="180"/>
+      </w:pPr>
+    </w:lvl>
+    <w:lvl w:ilvl="3" w:tplc="0409000F" w:tentative="1">
+      <w:start w:val="1"/>
+      <w:numFmt w:val="decimal"/>
+      <w:lvlText w:val="%4."/>
+      <w:lvlJc w:val="left"/>
+      <w:pPr>
+        <w:ind w:left="2880" w:hanging="360"/>
+      </w:pPr>
+    </w:lvl>
+    <w:lvl w:ilvl="4" w:tplc="04090019" w:tentative="1">
+      <w:start w:val="1"/>
+      <w:numFmt w:val="lowerLetter"/>
+      <w:lvlText w:val="%5."/>
+      <w:lvlJc w:val="left"/>
+      <w:pPr>
+        <w:ind w:left="3600" w:hanging="360"/>
+      </w:pPr>
+    </w:lvl>
+    <w:lvl w:ilvl="5" w:tplc="0409001B" w:tentative="1">
+      <w:start w:val="1"/>
+      <w:numFmt w:val="lowerRoman"/>
+      <w:lvlText w:val="%6."/>
+      <w:lvlJc w:val="right"/>
+      <w:pPr>
+        <w:ind w:left="4320" w:hanging="180"/>
+      </w:pPr>
+    </w:lvl>
+    <w:lvl w:ilvl="6" w:tplc="0409000F" w:tentative="1">
+      <w:start w:val="1"/>
+      <w:numFmt w:val="decimal"/>
+      <w:lvlText w:val="%7."/>
+      <w:lvlJc w:val="left"/>
+      <w:pPr>
+        <w:ind w:left="5040" w:hanging="360"/>
+      </w:pPr>
+    </w:lvl>
+    <w:lvl w:ilvl="7" w:tplc="04090019" w:tentative="1">
+      <w:start w:val="1"/>
+      <w:numFmt w:val="lowerLetter"/>
+      <w:lvlText w:val="%8."/>
+      <w:lvlJc w:val="left"/>
+      <w:pPr>
+        <w:ind w:left="5760" w:hanging="360"/>
+      </w:pPr>
+    </w:lvl>
+    <w:lvl w:ilvl="8" w:tplc="0409001B" w:tentative="1">
+      <w:start w:val="1"/>
+      <w:numFmt w:val="lowerRoman"/>
+      <w:lvlText w:val="%9."/>
+      <w:lvlJc w:val="right"/>
+      <w:pPr>
+        <w:ind w:left="6480" w:hanging="180"/>
+      </w:pPr>
+    </w:lvl>
+  </w:abstractNum>
+  <w:abstractNum w:abstractNumId="1" w15:restartNumberingAfterBreak="0">
     <w:nsid w:val="019F589E"/>
     <w:multiLevelType w:val="hybridMultilevel"/>
     <w:tmpl w:val="14B496CE"/>
@@ -1757,7 +3240,7 @@
       </w:pPr>
     </w:lvl>
   </w:abstractNum>
-  <w:abstractNum w:abstractNumId="1" w15:restartNumberingAfterBreak="0">
+  <w:abstractNum w:abstractNumId="2" w15:restartNumberingAfterBreak="0">
     <w:nsid w:val="2DBB26CF"/>
     <w:multiLevelType w:val="multilevel"/>
     <w:tmpl w:val="0B28481E"/>
@@ -1906,7 +3389,7 @@
       </w:rPr>
     </w:lvl>
   </w:abstractNum>
-  <w:abstractNum w:abstractNumId="2" w15:restartNumberingAfterBreak="0">
+  <w:abstractNum w:abstractNumId="3" w15:restartNumberingAfterBreak="0">
     <w:nsid w:val="4F070FD2"/>
     <w:multiLevelType w:val="hybridMultilevel"/>
     <w:tmpl w:val="348C62F4"/>
@@ -1995,7 +3478,364 @@
       </w:pPr>
     </w:lvl>
   </w:abstractNum>
-  <w:abstractNum w:abstractNumId="3" w15:restartNumberingAfterBreak="0">
+  <w:abstractNum w:abstractNumId="4" w15:restartNumberingAfterBreak="0">
+    <w:nsid w:val="50BE4FB1"/>
+    <w:multiLevelType w:val="hybridMultilevel"/>
+    <w:tmpl w:val="92B0E7A8"/>
+    <w:lvl w:ilvl="0" w:tplc="C2FCC120">
+      <w:start w:val="1"/>
+      <w:numFmt w:val="decimal"/>
+      <w:lvlText w:val="%1)"/>
+      <w:lvlJc w:val="left"/>
+      <w:pPr>
+        <w:ind w:left="1800" w:hanging="360"/>
+      </w:pPr>
+      <w:rPr>
+        <w:rFonts w:hint="default"/>
+      </w:rPr>
+    </w:lvl>
+    <w:lvl w:ilvl="1" w:tplc="04090019">
+      <w:start w:val="1"/>
+      <w:numFmt w:val="lowerLetter"/>
+      <w:lvlText w:val="%2."/>
+      <w:lvlJc w:val="left"/>
+      <w:pPr>
+        <w:ind w:left="2520" w:hanging="360"/>
+      </w:pPr>
+    </w:lvl>
+    <w:lvl w:ilvl="2" w:tplc="0409001B" w:tentative="1">
+      <w:start w:val="1"/>
+      <w:numFmt w:val="lowerRoman"/>
+      <w:lvlText w:val="%3."/>
+      <w:lvlJc w:val="right"/>
+      <w:pPr>
+        <w:ind w:left="3240" w:hanging="180"/>
+      </w:pPr>
+    </w:lvl>
+    <w:lvl w:ilvl="3" w:tplc="0409000F" w:tentative="1">
+      <w:start w:val="1"/>
+      <w:numFmt w:val="decimal"/>
+      <w:lvlText w:val="%4."/>
+      <w:lvlJc w:val="left"/>
+      <w:pPr>
+        <w:ind w:left="3960" w:hanging="360"/>
+      </w:pPr>
+    </w:lvl>
+    <w:lvl w:ilvl="4" w:tplc="04090019" w:tentative="1">
+      <w:start w:val="1"/>
+      <w:numFmt w:val="lowerLetter"/>
+      <w:lvlText w:val="%5."/>
+      <w:lvlJc w:val="left"/>
+      <w:pPr>
+        <w:ind w:left="4680" w:hanging="360"/>
+      </w:pPr>
+    </w:lvl>
+    <w:lvl w:ilvl="5" w:tplc="0409001B" w:tentative="1">
+      <w:start w:val="1"/>
+      <w:numFmt w:val="lowerRoman"/>
+      <w:lvlText w:val="%6."/>
+      <w:lvlJc w:val="right"/>
+      <w:pPr>
+        <w:ind w:left="5400" w:hanging="180"/>
+      </w:pPr>
+    </w:lvl>
+    <w:lvl w:ilvl="6" w:tplc="0409000F" w:tentative="1">
+      <w:start w:val="1"/>
+      <w:numFmt w:val="decimal"/>
+      <w:lvlText w:val="%7."/>
+      <w:lvlJc w:val="left"/>
+      <w:pPr>
+        <w:ind w:left="6120" w:hanging="360"/>
+      </w:pPr>
+    </w:lvl>
+    <w:lvl w:ilvl="7" w:tplc="04090019" w:tentative="1">
+      <w:start w:val="1"/>
+      <w:numFmt w:val="lowerLetter"/>
+      <w:lvlText w:val="%8."/>
+      <w:lvlJc w:val="left"/>
+      <w:pPr>
+        <w:ind w:left="6840" w:hanging="360"/>
+      </w:pPr>
+    </w:lvl>
+    <w:lvl w:ilvl="8" w:tplc="0409001B" w:tentative="1">
+      <w:start w:val="1"/>
+      <w:numFmt w:val="lowerRoman"/>
+      <w:lvlText w:val="%9."/>
+      <w:lvlJc w:val="right"/>
+      <w:pPr>
+        <w:ind w:left="7560" w:hanging="180"/>
+      </w:pPr>
+    </w:lvl>
+  </w:abstractNum>
+  <w:abstractNum w:abstractNumId="5" w15:restartNumberingAfterBreak="0">
+    <w:nsid w:val="5B8C555C"/>
+    <w:multiLevelType w:val="hybridMultilevel"/>
+    <w:tmpl w:val="E77E7678"/>
+    <w:lvl w:ilvl="0" w:tplc="04090011">
+      <w:start w:val="1"/>
+      <w:numFmt w:val="decimal"/>
+      <w:lvlText w:val="%1)"/>
+      <w:lvlJc w:val="left"/>
+      <w:pPr>
+        <w:ind w:left="720" w:hanging="360"/>
+      </w:pPr>
+      <w:rPr>
+        <w:rFonts w:hint="default"/>
+      </w:rPr>
+    </w:lvl>
+    <w:lvl w:ilvl="1" w:tplc="04090019">
+      <w:start w:val="1"/>
+      <w:numFmt w:val="lowerLetter"/>
+      <w:lvlText w:val="%2."/>
+      <w:lvlJc w:val="left"/>
+      <w:pPr>
+        <w:ind w:left="1440" w:hanging="360"/>
+      </w:pPr>
+    </w:lvl>
+    <w:lvl w:ilvl="2" w:tplc="0409001B" w:tentative="1">
+      <w:start w:val="1"/>
+      <w:numFmt w:val="lowerRoman"/>
+      <w:lvlText w:val="%3."/>
+      <w:lvlJc w:val="right"/>
+      <w:pPr>
+        <w:ind w:left="2160" w:hanging="180"/>
+      </w:pPr>
+    </w:lvl>
+    <w:lvl w:ilvl="3" w:tplc="0409000F" w:tentative="1">
+      <w:start w:val="1"/>
+      <w:numFmt w:val="decimal"/>
+      <w:lvlText w:val="%4."/>
+      <w:lvlJc w:val="left"/>
+      <w:pPr>
+        <w:ind w:left="2880" w:hanging="360"/>
+      </w:pPr>
+    </w:lvl>
+    <w:lvl w:ilvl="4" w:tplc="04090019" w:tentative="1">
+      <w:start w:val="1"/>
+      <w:numFmt w:val="lowerLetter"/>
+      <w:lvlText w:val="%5."/>
+      <w:lvlJc w:val="left"/>
+      <w:pPr>
+        <w:ind w:left="3600" w:hanging="360"/>
+      </w:pPr>
+    </w:lvl>
+    <w:lvl w:ilvl="5" w:tplc="0409001B" w:tentative="1">
+      <w:start w:val="1"/>
+      <w:numFmt w:val="lowerRoman"/>
+      <w:lvlText w:val="%6."/>
+      <w:lvlJc w:val="right"/>
+      <w:pPr>
+        <w:ind w:left="4320" w:hanging="180"/>
+      </w:pPr>
+    </w:lvl>
+    <w:lvl w:ilvl="6" w:tplc="0409000F" w:tentative="1">
+      <w:start w:val="1"/>
+      <w:numFmt w:val="decimal"/>
+      <w:lvlText w:val="%7."/>
+      <w:lvlJc w:val="left"/>
+      <w:pPr>
+        <w:ind w:left="5040" w:hanging="360"/>
+      </w:pPr>
+    </w:lvl>
+    <w:lvl w:ilvl="7" w:tplc="04090019" w:tentative="1">
+      <w:start w:val="1"/>
+      <w:numFmt w:val="lowerLetter"/>
+      <w:lvlText w:val="%8."/>
+      <w:lvlJc w:val="left"/>
+      <w:pPr>
+        <w:ind w:left="5760" w:hanging="360"/>
+      </w:pPr>
+    </w:lvl>
+    <w:lvl w:ilvl="8" w:tplc="0409001B" w:tentative="1">
+      <w:start w:val="1"/>
+      <w:numFmt w:val="lowerRoman"/>
+      <w:lvlText w:val="%9."/>
+      <w:lvlJc w:val="right"/>
+      <w:pPr>
+        <w:ind w:left="6480" w:hanging="180"/>
+      </w:pPr>
+    </w:lvl>
+  </w:abstractNum>
+  <w:abstractNum w:abstractNumId="6" w15:restartNumberingAfterBreak="0">
+    <w:nsid w:val="62F81B48"/>
+    <w:multiLevelType w:val="hybridMultilevel"/>
+    <w:tmpl w:val="E43C672C"/>
+    <w:lvl w:ilvl="0" w:tplc="04090011">
+      <w:start w:val="1"/>
+      <w:numFmt w:val="decimal"/>
+      <w:lvlText w:val="%1)"/>
+      <w:lvlJc w:val="left"/>
+      <w:pPr>
+        <w:ind w:left="720" w:hanging="360"/>
+      </w:pPr>
+      <w:rPr>
+        <w:rFonts w:ascii="Times New Roman" w:hAnsi="Times New Roman" w:cs="Times New Roman" w:hint="default"/>
+        <w:color w:val="auto"/>
+      </w:rPr>
+    </w:lvl>
+    <w:lvl w:ilvl="1" w:tplc="04090019">
+      <w:start w:val="1"/>
+      <w:numFmt w:val="lowerLetter"/>
+      <w:lvlText w:val="%2."/>
+      <w:lvlJc w:val="left"/>
+      <w:pPr>
+        <w:ind w:left="1440" w:hanging="360"/>
+      </w:pPr>
+    </w:lvl>
+    <w:lvl w:ilvl="2" w:tplc="0409001B" w:tentative="1">
+      <w:start w:val="1"/>
+      <w:numFmt w:val="lowerRoman"/>
+      <w:lvlText w:val="%3."/>
+      <w:lvlJc w:val="right"/>
+      <w:pPr>
+        <w:ind w:left="2160" w:hanging="180"/>
+      </w:pPr>
+    </w:lvl>
+    <w:lvl w:ilvl="3" w:tplc="0409000F" w:tentative="1">
+      <w:start w:val="1"/>
+      <w:numFmt w:val="decimal"/>
+      <w:lvlText w:val="%4."/>
+      <w:lvlJc w:val="left"/>
+      <w:pPr>
+        <w:ind w:left="2880" w:hanging="360"/>
+      </w:pPr>
+    </w:lvl>
+    <w:lvl w:ilvl="4" w:tplc="04090019" w:tentative="1">
+      <w:start w:val="1"/>
+      <w:numFmt w:val="lowerLetter"/>
+      <w:lvlText w:val="%5."/>
+      <w:lvlJc w:val="left"/>
+      <w:pPr>
+        <w:ind w:left="3600" w:hanging="360"/>
+      </w:pPr>
+    </w:lvl>
+    <w:lvl w:ilvl="5" w:tplc="0409001B" w:tentative="1">
+      <w:start w:val="1"/>
+      <w:numFmt w:val="lowerRoman"/>
+      <w:lvlText w:val="%6."/>
+      <w:lvlJc w:val="right"/>
+      <w:pPr>
+        <w:ind w:left="4320" w:hanging="180"/>
+      </w:pPr>
+    </w:lvl>
+    <w:lvl w:ilvl="6" w:tplc="0409000F" w:tentative="1">
+      <w:start w:val="1"/>
+      <w:numFmt w:val="decimal"/>
+      <w:lvlText w:val="%7."/>
+      <w:lvlJc w:val="left"/>
+      <w:pPr>
+        <w:ind w:left="5040" w:hanging="360"/>
+      </w:pPr>
+    </w:lvl>
+    <w:lvl w:ilvl="7" w:tplc="04090019" w:tentative="1">
+      <w:start w:val="1"/>
+      <w:numFmt w:val="lowerLetter"/>
+      <w:lvlText w:val="%8."/>
+      <w:lvlJc w:val="left"/>
+      <w:pPr>
+        <w:ind w:left="5760" w:hanging="360"/>
+      </w:pPr>
+    </w:lvl>
+    <w:lvl w:ilvl="8" w:tplc="0409001B" w:tentative="1">
+      <w:start w:val="1"/>
+      <w:numFmt w:val="lowerRoman"/>
+      <w:lvlText w:val="%9."/>
+      <w:lvlJc w:val="right"/>
+      <w:pPr>
+        <w:ind w:left="6480" w:hanging="180"/>
+      </w:pPr>
+    </w:lvl>
+  </w:abstractNum>
+  <w:abstractNum w:abstractNumId="7" w15:restartNumberingAfterBreak="0">
+    <w:nsid w:val="6E4C3096"/>
+    <w:multiLevelType w:val="hybridMultilevel"/>
+    <w:tmpl w:val="E754352C"/>
+    <w:lvl w:ilvl="0" w:tplc="04090011">
+      <w:start w:val="1"/>
+      <w:numFmt w:val="decimal"/>
+      <w:lvlText w:val="%1)"/>
+      <w:lvlJc w:val="left"/>
+      <w:pPr>
+        <w:ind w:left="720" w:hanging="360"/>
+      </w:pPr>
+      <w:rPr>
+        <w:rFonts w:hint="default"/>
+      </w:rPr>
+    </w:lvl>
+    <w:lvl w:ilvl="1" w:tplc="04090019" w:tentative="1">
+      <w:start w:val="1"/>
+      <w:numFmt w:val="lowerLetter"/>
+      <w:lvlText w:val="%2."/>
+      <w:lvlJc w:val="left"/>
+      <w:pPr>
+        <w:ind w:left="1440" w:hanging="360"/>
+      </w:pPr>
+    </w:lvl>
+    <w:lvl w:ilvl="2" w:tplc="0409001B" w:tentative="1">
+      <w:start w:val="1"/>
+      <w:numFmt w:val="lowerRoman"/>
+      <w:lvlText w:val="%3."/>
+      <w:lvlJc w:val="right"/>
+      <w:pPr>
+        <w:ind w:left="2160" w:hanging="180"/>
+      </w:pPr>
+    </w:lvl>
+    <w:lvl w:ilvl="3" w:tplc="0409000F" w:tentative="1">
+      <w:start w:val="1"/>
+      <w:numFmt w:val="decimal"/>
+      <w:lvlText w:val="%4."/>
+      <w:lvlJc w:val="left"/>
+      <w:pPr>
+        <w:ind w:left="2880" w:hanging="360"/>
+      </w:pPr>
+    </w:lvl>
+    <w:lvl w:ilvl="4" w:tplc="04090019" w:tentative="1">
+      <w:start w:val="1"/>
+      <w:numFmt w:val="lowerLetter"/>
+      <w:lvlText w:val="%5."/>
+      <w:lvlJc w:val="left"/>
+      <w:pPr>
+        <w:ind w:left="3600" w:hanging="360"/>
+      </w:pPr>
+    </w:lvl>
+    <w:lvl w:ilvl="5" w:tplc="0409001B" w:tentative="1">
+      <w:start w:val="1"/>
+      <w:numFmt w:val="lowerRoman"/>
+      <w:lvlText w:val="%6."/>
+      <w:lvlJc w:val="right"/>
+      <w:pPr>
+        <w:ind w:left="4320" w:hanging="180"/>
+      </w:pPr>
+    </w:lvl>
+    <w:lvl w:ilvl="6" w:tplc="0409000F" w:tentative="1">
+      <w:start w:val="1"/>
+      <w:numFmt w:val="decimal"/>
+      <w:lvlText w:val="%7."/>
+      <w:lvlJc w:val="left"/>
+      <w:pPr>
+        <w:ind w:left="5040" w:hanging="360"/>
+      </w:pPr>
+    </w:lvl>
+    <w:lvl w:ilvl="7" w:tplc="04090019" w:tentative="1">
+      <w:start w:val="1"/>
+      <w:numFmt w:val="lowerLetter"/>
+      <w:lvlText w:val="%8."/>
+      <w:lvlJc w:val="left"/>
+      <w:pPr>
+        <w:ind w:left="5760" w:hanging="360"/>
+      </w:pPr>
+    </w:lvl>
+    <w:lvl w:ilvl="8" w:tplc="0409001B" w:tentative="1">
+      <w:start w:val="1"/>
+      <w:numFmt w:val="lowerRoman"/>
+      <w:lvlText w:val="%9."/>
+      <w:lvlJc w:val="right"/>
+      <w:pPr>
+        <w:ind w:left="6480" w:hanging="180"/>
+      </w:pPr>
+    </w:lvl>
+  </w:abstractNum>
+  <w:abstractNum w:abstractNumId="8" w15:restartNumberingAfterBreak="0">
     <w:nsid w:val="7B2D39AC"/>
     <w:multiLevelType w:val="hybridMultilevel"/>
     <w:tmpl w:val="AEAA4742"/>
@@ -2085,16 +3925,31 @@
     </w:lvl>
   </w:abstractNum>
   <w:num w:numId="1">
+    <w:abstractNumId w:val="2"/>
+  </w:num>
+  <w:num w:numId="2">
+    <w:abstractNumId w:val="3"/>
+  </w:num>
+  <w:num w:numId="3">
     <w:abstractNumId w:val="1"/>
   </w:num>
-  <w:num w:numId="2">
-    <w:abstractNumId w:val="2"/>
+  <w:num w:numId="4">
+    <w:abstractNumId w:val="8"/>
   </w:num>
-  <w:num w:numId="3">
+  <w:num w:numId="5">
+    <w:abstractNumId w:val="5"/>
+  </w:num>
+  <w:num w:numId="6">
+    <w:abstractNumId w:val="6"/>
+  </w:num>
+  <w:num w:numId="7">
     <w:abstractNumId w:val="0"/>
   </w:num>
-  <w:num w:numId="4">
-    <w:abstractNumId w:val="3"/>
+  <w:num w:numId="8">
+    <w:abstractNumId w:val="7"/>
+  </w:num>
+  <w:num w:numId="9">
+    <w:abstractNumId w:val="4"/>
   </w:num>
 </w:numbering>
 </file>
@@ -2494,6 +4349,7 @@
   <w:style w:type="paragraph" w:default="1" w:styleId="Normal">
     <w:name w:val="Normal"/>
     <w:qFormat/>
+    <w:rsid w:val="006C2523"/>
   </w:style>
   <w:style w:type="character" w:default="1" w:styleId="DefaultParagraphFont">
     <w:name w:val="Default Paragraph Font"/>
@@ -2566,6 +4422,58 @@
       <w:ind w:left="720"/>
       <w:contextualSpacing/>
     </w:pPr>
+  </w:style>
+  <w:style w:type="character" w:styleId="HTMLCode">
+    <w:name w:val="HTML Code"/>
+    <w:basedOn w:val="DefaultParagraphFont"/>
+    <w:uiPriority w:val="99"/>
+    <w:semiHidden/>
+    <w:unhideWhenUsed/>
+    <w:rsid w:val="00674F88"/>
+    <w:rPr>
+      <w:rFonts w:ascii="Courier New" w:eastAsia="Times New Roman" w:hAnsi="Courier New" w:cs="Courier New"/>
+      <w:sz w:val="20"/>
+      <w:szCs w:val="20"/>
+    </w:rPr>
+  </w:style>
+  <w:style w:type="paragraph" w:styleId="FootnoteText">
+    <w:name w:val="footnote text"/>
+    <w:basedOn w:val="Normal"/>
+    <w:link w:val="FootnoteTextChar"/>
+    <w:uiPriority w:val="99"/>
+    <w:semiHidden/>
+    <w:unhideWhenUsed/>
+    <w:rsid w:val="00B1789B"/>
+    <w:pPr>
+      <w:spacing w:after="0" w:line="240" w:lineRule="auto"/>
+    </w:pPr>
+    <w:rPr>
+      <w:sz w:val="20"/>
+      <w:szCs w:val="20"/>
+    </w:rPr>
+  </w:style>
+  <w:style w:type="character" w:customStyle="1" w:styleId="FootnoteTextChar">
+    <w:name w:val="Footnote Text Char"/>
+    <w:basedOn w:val="DefaultParagraphFont"/>
+    <w:link w:val="FootnoteText"/>
+    <w:uiPriority w:val="99"/>
+    <w:semiHidden/>
+    <w:rsid w:val="00B1789B"/>
+    <w:rPr>
+      <w:sz w:val="20"/>
+      <w:szCs w:val="20"/>
+    </w:rPr>
+  </w:style>
+  <w:style w:type="character" w:styleId="FootnoteReference">
+    <w:name w:val="footnote reference"/>
+    <w:basedOn w:val="DefaultParagraphFont"/>
+    <w:uiPriority w:val="99"/>
+    <w:semiHidden/>
+    <w:unhideWhenUsed/>
+    <w:rsid w:val="00B1789B"/>
+    <w:rPr>
+      <w:vertAlign w:val="superscript"/>
+    </w:rPr>
   </w:style>
 </w:styles>
 </file>
@@ -2863,4 +4771,16 @@
     </a:ext>
   </a:extLst>
 </a:theme>
+</file>
+
+<file path=customXml/item1.xml><?xml version="1.0" encoding="utf-8"?>
+<b:Sources xmlns:b="http://schemas.openxmlformats.org/officeDocument/2006/bibliography" xmlns="http://schemas.openxmlformats.org/officeDocument/2006/bibliography" SelectedStyle="\APASixthEditionOfficeOnline.xsl" StyleName="APA" Version="6"/>
+</file>
+
+<file path=customXml/itemProps1.xml><?xml version="1.0" encoding="utf-8"?>
+<ds:datastoreItem xmlns:ds="http://schemas.openxmlformats.org/officeDocument/2006/customXml" ds:itemID="{3217DA53-29E8-4867-9DC3-47525CEB0EFD}">
+  <ds:schemaRefs>
+    <ds:schemaRef ds:uri="http://schemas.openxmlformats.org/officeDocument/2006/bibliography"/>
+  </ds:schemaRefs>
+</ds:datastoreItem>
 </file>
</xml_diff>

<commit_message>
Enhance Python tutorial with detailed explanations on list and tuple methods, including examples for each method.
</commit_message>
<xml_diff>
--- a/PythonTutorial.docx
+++ b/PythonTutorial.docx
@@ -1338,19 +1338,7 @@
         <w:rPr>
           <w:rFonts w:ascii="Times New Roman" w:hAnsi="Times New Roman" w:cs="Times New Roman"/>
         </w:rPr>
-        <w:t>String is data type is sequence of character in group of sentence, paragraph or single character is is binded with ‘’, “”, “</w:t>
-      </w:r>
-      <w:r>
-        <w:rPr>
-          <w:rFonts w:ascii="Times New Roman" w:hAnsi="Times New Roman" w:cs="Times New Roman"/>
-        </w:rPr>
-        <w:t>““””</w:t>
-      </w:r>
-      <w:r>
-        <w:rPr>
-          <w:rFonts w:ascii="Times New Roman" w:hAnsi="Times New Roman" w:cs="Times New Roman"/>
-        </w:rPr>
-        <w:t>” is called string.</w:t>
+        <w:t>String is data type is sequence of character in group of sentence, paragraph or single character is is binded with ‘’, “”, “““””” is called string.</w:t>
       </w:r>
       <w:r>
         <w:rPr>
@@ -1540,13 +1528,7 @@
         <w:t xml:space="preserve">Indexing: </w:t>
       </w:r>
       <w:r>
-        <w:t>In Python, an index is the position number of a character inside a string.</w:t>
-      </w:r>
-      <w:r>
-        <w:t xml:space="preserve"> </w:t>
-      </w:r>
-      <w:r>
-        <w:t xml:space="preserve">Python uses zero-based indexing, which means the first character starts at index </w:t>
+        <w:t xml:space="preserve">In Python, an index is the position number of a character inside a string. Python uses zero-based indexing, which means the first character starts at index </w:t>
       </w:r>
       <w:r>
         <w:rPr>
@@ -1653,16 +1635,7 @@
         <w:ind w:firstLine="720"/>
       </w:pPr>
       <w:r>
-        <w:t>Print(phrease_1[</w:t>
-      </w:r>
-      <w:r>
-        <w:t>,4</w:t>
-      </w:r>
-      <w:r>
-        <w:t>])</w:t>
-      </w:r>
-      <w:r>
-        <w:t xml:space="preserve"> by it will consider it from start </w:t>
+        <w:t xml:space="preserve">Print(phrease_1[,4]) by it will consider it from start </w:t>
       </w:r>
     </w:p>
     <w:p>
@@ -1671,16 +1644,7 @@
         <w:ind w:firstLine="720"/>
       </w:pPr>
       <w:r>
-        <w:t>Print(phrease_1[</w:t>
-      </w:r>
-      <w:r>
-        <w:t>5,</w:t>
-      </w:r>
-      <w:r>
-        <w:t>]) b</w:t>
-      </w:r>
-      <w:r>
-        <w:t>y it will consider it till end of string</w:t>
+        <w:t>Print(phrease_1[5,]) by it will consider it till end of string</w:t>
       </w:r>
     </w:p>
     <w:p>
@@ -1705,13 +1669,7 @@
         <w:ind w:firstLine="720"/>
       </w:pPr>
       <w:r>
-        <w:t>Print(phrease_1[</w:t>
-      </w:r>
-      <w:r>
-        <w:t>-4,-1</w:t>
-      </w:r>
-      <w:r>
-        <w:t>])</w:t>
+        <w:t>Print(phrease_1[-4,-1])</w:t>
       </w:r>
     </w:p>
     <w:p>
@@ -1878,57 +1836,22 @@
         <w:rPr>
           <w:rFonts w:ascii="Times New Roman" w:hAnsi="Times New Roman" w:cs="Times New Roman"/>
         </w:rPr>
-        <w:t>s</w:t>
-      </w:r>
-      <w:r>
-        <w:rPr>
-          <w:rFonts w:ascii="Times New Roman" w:hAnsi="Times New Roman" w:cs="Times New Roman"/>
-        </w:rPr>
-        <w:t>tatement=”This is my python brush up”</w:t>
-      </w:r>
-    </w:p>
-    <w:p>
-      <w:pPr>
-        <w:pStyle w:val="ListParagraph"/>
-        <w:rPr>
-          <w:rFonts w:ascii="Times New Roman" w:hAnsi="Times New Roman" w:cs="Times New Roman"/>
-        </w:rPr>
-      </w:pPr>
-      <w:r>
-        <w:rPr>
-          <w:rFonts w:ascii="Times New Roman" w:hAnsi="Times New Roman" w:cs="Times New Roman"/>
-        </w:rPr>
-        <w:tab/>
-      </w:r>
-      <w:r>
-        <w:rPr>
-          <w:rFonts w:ascii="Times New Roman" w:hAnsi="Times New Roman" w:cs="Times New Roman"/>
-        </w:rPr>
-        <w:t>Statement.endsWith</w:t>
-      </w:r>
-      <w:r>
-        <w:rPr>
-          <w:rFonts w:ascii="Times New Roman" w:hAnsi="Times New Roman" w:cs="Times New Roman"/>
-        </w:rPr>
-        <w:t>(</w:t>
-      </w:r>
-      <w:r>
-        <w:rPr>
-          <w:rFonts w:ascii="Times New Roman" w:hAnsi="Times New Roman" w:cs="Times New Roman"/>
-        </w:rPr>
-        <w:t>“p”</w:t>
-      </w:r>
-      <w:r>
-        <w:rPr>
-          <w:rFonts w:ascii="Times New Roman" w:hAnsi="Times New Roman" w:cs="Times New Roman"/>
-        </w:rPr>
-        <w:t>)</w:t>
-      </w:r>
-      <w:r>
-        <w:rPr>
-          <w:rFonts w:ascii="Times New Roman" w:hAnsi="Times New Roman" w:cs="Times New Roman"/>
-        </w:rPr>
-        <w:t xml:space="preserve">  it will return true</w:t>
+        <w:t>statement=”This is my python brush up”</w:t>
+      </w:r>
+    </w:p>
+    <w:p>
+      <w:pPr>
+        <w:pStyle w:val="ListParagraph"/>
+        <w:rPr>
+          <w:rFonts w:ascii="Times New Roman" w:hAnsi="Times New Roman" w:cs="Times New Roman"/>
+        </w:rPr>
+      </w:pPr>
+      <w:r>
+        <w:rPr>
+          <w:rFonts w:ascii="Times New Roman" w:hAnsi="Times New Roman" w:cs="Times New Roman"/>
+        </w:rPr>
+        <w:tab/>
+        <w:t>Statement.endsWith(“p”)  it will return true</w:t>
       </w:r>
     </w:p>
     <w:p>
@@ -1968,19 +1891,7 @@
         <w:rPr>
           <w:rFonts w:ascii="Times New Roman" w:hAnsi="Times New Roman" w:cs="Times New Roman"/>
         </w:rPr>
-        <w:t>statement=”</w:t>
-      </w:r>
-      <w:r>
-        <w:rPr>
-          <w:rFonts w:ascii="Times New Roman" w:hAnsi="Times New Roman" w:cs="Times New Roman"/>
-        </w:rPr>
-        <w:t>t</w:t>
-      </w:r>
-      <w:r>
-        <w:rPr>
-          <w:rFonts w:ascii="Times New Roman" w:hAnsi="Times New Roman" w:cs="Times New Roman"/>
-        </w:rPr>
-        <w:t>his is my python brush up”</w:t>
+        <w:t>statement=”this is my python brush up”</w:t>
       </w:r>
     </w:p>
     <w:p>
@@ -2161,8 +2072,6 @@
       </w:pPr>
       <w:r>
         <w:tab/>
-      </w:r>
-      <w:r>
         <w:t>Phrease_1 = “I am Tejas from Solapur which from maharashtra”</w:t>
       </w:r>
     </w:p>
@@ -2172,19 +2081,7 @@
       </w:pPr>
       <w:r>
         <w:tab/>
-        <w:t>Phrease_</w:t>
-      </w:r>
-      <w:r>
-        <w:t>1.count</w:t>
-      </w:r>
-      <w:r>
-        <w:t>(“</w:t>
-      </w:r>
-      <w:r>
-        <w:t>a</w:t>
-      </w:r>
-      <w:r>
-        <w:t xml:space="preserve">”) </w:t>
+        <w:t xml:space="preserve">Phrease_1.count(“a”) </w:t>
       </w:r>
     </w:p>
     <w:p>
@@ -2358,13 +2255,7 @@
       </w:pPr>
       <w:r>
         <w:tab/>
-        <w:t>age = int(</w:t>
-      </w:r>
-      <w:r>
-        <w:t>inpu</w:t>
-      </w:r>
-      <w:r>
-        <w:t>t(“Enter your age”))</w:t>
+        <w:t>age = int(input(“Enter your age”))</w:t>
       </w:r>
     </w:p>
     <w:p>
@@ -2385,13 +2276,7 @@
       </w:r>
       <w:r>
         <w:tab/>
-        <w:t>print(“You can drive a bike and car with issued lic</w:t>
-      </w:r>
-      <w:r>
-        <w:t>ens</w:t>
-      </w:r>
-      <w:r>
-        <w:t>e.”)</w:t>
+        <w:t>print(“You can drive a bike and car with issued license.”)</w:t>
       </w:r>
     </w:p>
     <w:p>
@@ -2412,31 +2297,7 @@
       </w:r>
       <w:r>
         <w:tab/>
-        <w:t>print(“</w:t>
-      </w:r>
-      <w:r>
-        <w:t>You can</w:t>
-      </w:r>
-      <w:r>
-        <w:t>not</w:t>
-      </w:r>
-      <w:r>
-        <w:t xml:space="preserve"> drive a bike and car with</w:t>
-      </w:r>
-      <w:r>
-        <w:t>out issuing</w:t>
-      </w:r>
-      <w:r>
-        <w:t xml:space="preserve"> lic</w:t>
-      </w:r>
-      <w:r>
-        <w:t>ens</w:t>
-      </w:r>
-      <w:r>
-        <w:t>e.</w:t>
-      </w:r>
-      <w:r>
-        <w:t>”)</w:t>
+        <w:t>print(“You cannot drive a bike and car without issuing license.”)</w:t>
       </w:r>
     </w:p>
     <w:p>
@@ -2674,8 +2535,6 @@
       </w:pPr>
       <w:r>
         <w:tab/>
-      </w:r>
-      <w:r>
         <w:t>age = int(input("Enter your age"))</w:t>
       </w:r>
     </w:p>
@@ -2986,18 +2845,1196 @@
       </w:pPr>
       <w:r>
         <w:tab/>
-        <w:t>Print(marks[2 : len(marks)-2] : 2</w:t>
-      </w:r>
+        <w:t>Print(marks[2 : len(marks)-2] : 2)</w:t>
+      </w:r>
+    </w:p>
+    <w:p>
+      <w:pPr>
+        <w:pStyle w:val="ListParagraph"/>
+        <w:ind w:left="1800"/>
+      </w:pPr>
+      <w:r>
+        <w:tab/>
+        <w:t>Print(marks[1:])</w:t>
+      </w:r>
+    </w:p>
+    <w:p>
+      <w:pPr>
+        <w:pStyle w:val="ListParagraph"/>
+        <w:ind w:left="1800"/>
+      </w:pPr>
+      <w:r>
+        <w:tab/>
+        <w:t>Print(marks[-2:-5])</w:t>
+      </w:r>
+    </w:p>
+    <w:p>
+      <w:pPr>
+        <w:pStyle w:val="ListParagraph"/>
+        <w:ind w:left="1800"/>
+      </w:pPr>
+    </w:p>
+    <w:p>
+      <w:pPr>
+        <w:pStyle w:val="ListParagraph"/>
+        <w:numPr>
+          <w:ilvl w:val="0"/>
+          <w:numId w:val="9"/>
+        </w:numPr>
+        <w:rPr>
+          <w:b/>
+          <w:bCs/>
+        </w:rPr>
+      </w:pPr>
+      <w:r>
+        <w:rPr>
+          <w:b/>
+          <w:bCs/>
+        </w:rPr>
+        <w:t>List Methods:</w:t>
+      </w:r>
+      <w:r>
+        <w:rPr>
+          <w:b/>
+          <w:bCs/>
+        </w:rPr>
+        <w:t xml:space="preserve"> </w:t>
+      </w:r>
+      <w:r>
+        <w:t>Python has some List specific methods, which perform add, remove, sort. Search and modify list elements. A list method is a function which you call directly on list using dot (.) notation.</w:t>
+      </w:r>
+    </w:p>
+    <w:p>
+      <w:pPr>
+        <w:pStyle w:val="ListParagraph"/>
+        <w:numPr>
+          <w:ilvl w:val="1"/>
+          <w:numId w:val="9"/>
+        </w:numPr>
+        <w:rPr>
+          <w:b/>
+          <w:bCs/>
+        </w:rPr>
+      </w:pPr>
+      <w:r>
+        <w:rPr>
+          <w:b/>
+          <w:bCs/>
+        </w:rPr>
+        <w:t>append</w:t>
+      </w:r>
+      <w:r>
+        <w:rPr>
+          <w:b/>
+          <w:bCs/>
+        </w:rPr>
+        <w:t>()</w:t>
+      </w:r>
+      <w:r>
+        <w:rPr>
+          <w:b/>
+          <w:bCs/>
+        </w:rPr>
+        <w:t xml:space="preserve">: </w:t>
+      </w:r>
+      <w:r>
+        <w:t>adds one element to the end of list.</w:t>
+      </w:r>
+      <w:r>
+        <w:t xml:space="preserve"> It insert new element in list but</w:t>
+      </w:r>
+      <w:r>
+        <w:t xml:space="preserve"> return none and modify the original list</w:t>
+      </w:r>
+      <w:r>
+        <w:t>.</w:t>
+      </w:r>
+    </w:p>
+    <w:p>
+      <w:pPr>
+        <w:pStyle w:val="ListParagraph"/>
+        <w:ind w:left="2520"/>
+      </w:pPr>
+      <w:r>
+        <w:t xml:space="preserve">Example: </w:t>
+      </w:r>
+    </w:p>
+    <w:p>
+      <w:pPr>
+        <w:pStyle w:val="ListParagraph"/>
+        <w:ind w:left="2520"/>
+      </w:pPr>
+      <w:r>
+        <w:tab/>
+      </w:r>
+      <w:r>
+        <w:t>fruits= [“Apple”, “muskmelon”, ”Green Apple” ]</w:t>
+      </w:r>
+    </w:p>
+    <w:p>
+      <w:pPr>
+        <w:pStyle w:val="ListParagraph"/>
+        <w:ind w:left="2520"/>
+        <w:rPr>
+          <w:b/>
+          <w:bCs/>
+        </w:rPr>
+      </w:pPr>
+      <w:r>
+        <w:tab/>
+        <w:t>furits</w:t>
+      </w:r>
+      <w:r>
+        <w:rPr>
+          <w:b/>
+          <w:bCs/>
+        </w:rPr>
+        <w:t>.</w:t>
+      </w:r>
+      <w:r>
+        <w:t>append(</w:t>
+      </w:r>
+      <w:r>
+        <w:t>“</w:t>
+      </w:r>
+      <w:r>
+        <w:t>banana</w:t>
+      </w:r>
+      <w:r>
+        <w:t>”</w:t>
+      </w:r>
+      <w:r>
+        <w:t>)</w:t>
+      </w:r>
+      <w:r>
+        <w:rPr>
+          <w:b/>
+          <w:bCs/>
+        </w:rPr>
+        <w:t xml:space="preserve"> </w:t>
+      </w:r>
+    </w:p>
+    <w:p>
+      <w:pPr>
+        <w:pStyle w:val="ListParagraph"/>
+        <w:numPr>
+          <w:ilvl w:val="1"/>
+          <w:numId w:val="9"/>
+        </w:numPr>
+        <w:rPr>
+          <w:b/>
+          <w:bCs/>
+        </w:rPr>
+      </w:pPr>
+      <w:r>
+        <w:rPr>
+          <w:b/>
+          <w:bCs/>
+        </w:rPr>
+        <w:t xml:space="preserve">sort():  </w:t>
+      </w:r>
+      <w:r>
+        <w:t xml:space="preserve">it sort list elements in sorts data in ascending order and it does return any value it just return none and modify the original list. Likewise string functions they return updated values but </w:t>
+      </w:r>
+      <w:r>
+        <w:t>does not modify original string.</w:t>
+      </w:r>
+    </w:p>
+    <w:p>
+      <w:pPr>
+        <w:pStyle w:val="ListParagraph"/>
+        <w:ind w:left="2520"/>
+      </w:pPr>
+      <w:r>
+        <w:t>Example:</w:t>
+      </w:r>
+    </w:p>
+    <w:p>
+      <w:pPr>
+        <w:pStyle w:val="ListParagraph"/>
+        <w:ind w:left="2520"/>
+      </w:pPr>
+      <w:r>
+        <w:tab/>
+        <w:t>List = [2,3,1,5]</w:t>
+      </w:r>
+    </w:p>
+    <w:p>
+      <w:pPr>
+        <w:pStyle w:val="ListParagraph"/>
+        <w:ind w:left="2520"/>
+      </w:pPr>
+      <w:r>
+        <w:tab/>
+        <w:t>List.sort() – it sorts only does return values.</w:t>
+      </w:r>
+    </w:p>
+    <w:p>
+      <w:pPr>
+        <w:pStyle w:val="ListParagraph"/>
+        <w:ind w:left="2520" w:firstLine="360"/>
+      </w:pPr>
+      <w:r>
+        <w:t>Print(list)</w:t>
+      </w:r>
+    </w:p>
+    <w:p>
+      <w:pPr>
+        <w:pStyle w:val="ListParagraph"/>
+        <w:ind w:left="2520"/>
+        <w:rPr>
+          <w:b/>
+          <w:bCs/>
+        </w:rPr>
+      </w:pPr>
+      <w:r>
+        <w:rPr>
+          <w:b/>
+          <w:bCs/>
+        </w:rPr>
+        <w:t>Reverse sort</w:t>
+      </w:r>
+    </w:p>
+    <w:p>
+      <w:pPr>
+        <w:pStyle w:val="ListParagraph"/>
+        <w:ind w:left="2520"/>
+      </w:pPr>
+      <w:r>
+        <w:t>To sort list descending order we need to add list.sort(reverse = True)</w:t>
+      </w:r>
+    </w:p>
+    <w:p>
+      <w:pPr>
+        <w:pStyle w:val="ListParagraph"/>
+        <w:ind w:left="2520"/>
+      </w:pPr>
+      <w:r>
+        <w:t>Example:</w:t>
+      </w:r>
+    </w:p>
+    <w:p>
+      <w:pPr>
+        <w:pStyle w:val="ListParagraph"/>
+        <w:ind w:left="2520"/>
+      </w:pPr>
+      <w:r>
+        <w:tab/>
+        <w:t>List = [2,3,1,5]</w:t>
+      </w:r>
+    </w:p>
+    <w:p>
+      <w:pPr>
+        <w:pStyle w:val="ListParagraph"/>
+        <w:ind w:left="2520"/>
+      </w:pPr>
+      <w:r>
+        <w:tab/>
+        <w:t>List.sort(reverse = True) – it sorts only does return values.</w:t>
+      </w:r>
+    </w:p>
+    <w:p>
+      <w:pPr>
+        <w:pStyle w:val="ListParagraph"/>
+        <w:ind w:left="2520" w:firstLine="360"/>
+      </w:pPr>
+      <w:r>
+        <w:t>Print(list)</w:t>
+      </w:r>
+    </w:p>
+    <w:p>
+      <w:pPr>
+        <w:pStyle w:val="ListParagraph"/>
+        <w:numPr>
+          <w:ilvl w:val="1"/>
+          <w:numId w:val="9"/>
+        </w:numPr>
+      </w:pPr>
+      <w:r>
+        <w:rPr>
+          <w:b/>
+          <w:bCs/>
+        </w:rPr>
+        <w:t>reverse</w:t>
+      </w:r>
+      <w:r>
+        <w:rPr>
+          <w:b/>
+          <w:bCs/>
+        </w:rPr>
+        <w:t>()</w:t>
+      </w:r>
+      <w:r>
+        <w:rPr>
+          <w:b/>
+          <w:bCs/>
+        </w:rPr>
+        <w:t>:</w:t>
+      </w:r>
+      <w:r>
+        <w:t xml:space="preserve"> it reverse the list elements in opposite direction of original side. It modify the original list.</w:t>
+      </w:r>
+    </w:p>
+    <w:p>
+      <w:pPr>
+        <w:pStyle w:val="ListParagraph"/>
+        <w:ind w:left="2520"/>
+      </w:pPr>
+      <w:r>
+        <w:t>Example:</w:t>
+      </w:r>
+    </w:p>
+    <w:p>
+      <w:pPr>
+        <w:pStyle w:val="ListParagraph"/>
+        <w:ind w:left="2520"/>
+      </w:pPr>
+      <w:r>
+        <w:tab/>
+        <w:t>List = [2,3,1,5]</w:t>
+      </w:r>
+    </w:p>
+    <w:p>
+      <w:pPr>
+        <w:pStyle w:val="ListParagraph"/>
+        <w:ind w:left="2520"/>
+      </w:pPr>
+      <w:r>
+        <w:tab/>
+        <w:t>List.reverse() – it reverse the original list elements.</w:t>
+      </w:r>
+    </w:p>
+    <w:p>
+      <w:pPr>
+        <w:pStyle w:val="ListParagraph"/>
+        <w:ind w:left="2520" w:firstLine="360"/>
+      </w:pPr>
+      <w:r>
+        <w:t>Print(list)</w:t>
+      </w:r>
+    </w:p>
+    <w:p>
+      <w:pPr>
+        <w:pStyle w:val="ListParagraph"/>
+        <w:numPr>
+          <w:ilvl w:val="1"/>
+          <w:numId w:val="9"/>
+        </w:numPr>
+        <w:rPr>
+          <w:b/>
+          <w:bCs/>
+        </w:rPr>
+      </w:pPr>
+      <w:r>
+        <w:rPr>
+          <w:b/>
+          <w:bCs/>
+        </w:rPr>
+        <w:t>extend()</w:t>
+      </w:r>
+      <w:r>
+        <w:rPr>
+          <w:b/>
+          <w:bCs/>
+        </w:rPr>
+        <w:t xml:space="preserve">: </w:t>
+      </w:r>
+      <w:r>
+        <w:t>it adds each element from another iterable to the existing list. You can also extend list using string or tuple.</w:t>
+      </w:r>
+    </w:p>
+    <w:p>
+      <w:pPr>
+        <w:pStyle w:val="ListParagraph"/>
+        <w:ind w:left="2520"/>
+      </w:pPr>
+      <w:r>
+        <w:t>Example:</w:t>
+      </w:r>
+    </w:p>
+    <w:p>
+      <w:pPr>
+        <w:pStyle w:val="ListParagraph"/>
+        <w:ind w:left="2520"/>
+      </w:pPr>
+      <w:r>
+        <w:tab/>
+        <w:t>List = [1,2,3,4]</w:t>
+      </w:r>
+    </w:p>
+    <w:p>
+      <w:pPr>
+        <w:pStyle w:val="ListParagraph"/>
+        <w:ind w:left="2520"/>
+      </w:pPr>
+      <w:r>
+        <w:lastRenderedPageBreak/>
+        <w:tab/>
+        <w:t>List.extend(iterable)</w:t>
+      </w:r>
+    </w:p>
+    <w:p>
+      <w:pPr>
+        <w:pStyle w:val="ListParagraph"/>
+        <w:numPr>
+          <w:ilvl w:val="1"/>
+          <w:numId w:val="9"/>
+        </w:numPr>
+        <w:rPr>
+          <w:b/>
+          <w:bCs/>
+        </w:rPr>
+      </w:pPr>
+      <w:r>
+        <w:rPr>
+          <w:b/>
+          <w:bCs/>
+        </w:rPr>
+        <w:t>insert(</w:t>
+      </w:r>
+      <w:r>
+        <w:rPr>
+          <w:b/>
+          <w:bCs/>
+        </w:rPr>
+        <w:t>index, element</w:t>
+      </w:r>
+      <w:r>
+        <w:rPr>
+          <w:b/>
+          <w:bCs/>
+        </w:rPr>
+        <w:t>):</w:t>
+      </w:r>
+      <w:r>
+        <w:rPr>
+          <w:b/>
+          <w:bCs/>
+        </w:rPr>
+        <w:t xml:space="preserve"> </w:t>
+      </w:r>
+      <w:r>
+        <w:t>it add the new element in the specified index. This method takes to parameter index and element. Index is for set the element on that index. It also modify the original list.</w:t>
+      </w:r>
+    </w:p>
+    <w:p>
+      <w:pPr>
+        <w:pStyle w:val="ListParagraph"/>
+        <w:ind w:left="2520"/>
+      </w:pPr>
+      <w:r>
+        <w:t>Example:</w:t>
+      </w:r>
+    </w:p>
+    <w:p>
+      <w:pPr>
+        <w:pStyle w:val="ListParagraph"/>
+        <w:ind w:left="2520"/>
+      </w:pPr>
+      <w:r>
+        <w:tab/>
+      </w:r>
+      <w:r>
+        <w:t>List = [1,4,3,5,7]</w:t>
+      </w:r>
+    </w:p>
+    <w:p>
+      <w:pPr>
+        <w:pStyle w:val="ListParagraph"/>
+        <w:ind w:left="2520"/>
+      </w:pPr>
+      <w:r>
+        <w:t>List.insert(4,6) – it will insert 6 in 4 index of list</w:t>
+      </w:r>
+    </w:p>
+    <w:p>
+      <w:pPr>
+        <w:pStyle w:val="ListParagraph"/>
+        <w:ind w:left="2520"/>
+      </w:pPr>
+      <w:r>
+        <w:t>Print(list)</w:t>
+      </w:r>
+      <w:r>
+        <w:t xml:space="preserve"> </w:t>
+      </w:r>
+    </w:p>
+    <w:p>
+      <w:pPr>
+        <w:pStyle w:val="ListParagraph"/>
+        <w:numPr>
+          <w:ilvl w:val="1"/>
+          <w:numId w:val="9"/>
+        </w:numPr>
+        <w:rPr>
+          <w:b/>
+          <w:bCs/>
+        </w:rPr>
+      </w:pPr>
+      <w:r>
+        <w:rPr>
+          <w:b/>
+          <w:bCs/>
+        </w:rPr>
+        <w:t xml:space="preserve">remove() – </w:t>
+      </w:r>
+      <w:r>
+        <w:t>it removes the first occurrence of</w:t>
+      </w:r>
+      <w:r>
+        <w:t xml:space="preserve"> specified</w:t>
+      </w:r>
+      <w:r>
+        <w:t xml:space="preserve"> el</w:t>
+      </w:r>
+      <w:r>
+        <w:t>ement from</w:t>
+      </w:r>
+      <w:r>
+        <w:t xml:space="preserve"> list.</w:t>
+      </w:r>
+    </w:p>
+    <w:p>
+      <w:pPr>
+        <w:pStyle w:val="ListParagraph"/>
+        <w:ind w:left="2520"/>
+      </w:pPr>
+      <w:r>
+        <w:t>Example</w:t>
+      </w:r>
+      <w:r>
+        <w:t>:</w:t>
+      </w:r>
+    </w:p>
+    <w:p>
+      <w:pPr>
+        <w:pStyle w:val="ListParagraph"/>
+        <w:ind w:left="2520"/>
+      </w:pPr>
+      <w:r>
+        <w:tab/>
+        <w:t>List = [4,</w:t>
+      </w:r>
+      <w:r>
+        <w:t xml:space="preserve">1, </w:t>
+      </w:r>
+      <w:r>
+        <w:t>2,3, 6, 1]</w:t>
+      </w:r>
+    </w:p>
+    <w:p>
+      <w:pPr>
+        <w:pStyle w:val="ListParagraph"/>
+        <w:ind w:left="2520"/>
+      </w:pPr>
+      <w:r>
+        <w:tab/>
+        <w:t>List.remove(</w:t>
+      </w:r>
+      <w:r>
+        <w:t>1</w:t>
+      </w:r>
+      <w:r>
+        <w:t>) it will remove 4 from list.</w:t>
+      </w:r>
+    </w:p>
+    <w:p>
+      <w:pPr>
+        <w:pStyle w:val="ListParagraph"/>
+        <w:ind w:left="2520"/>
+      </w:pPr>
+      <w:r>
+        <w:tab/>
+        <w:t>Print(list)</w:t>
+      </w:r>
+    </w:p>
+    <w:p>
+      <w:pPr>
+        <w:pStyle w:val="ListParagraph"/>
+        <w:numPr>
+          <w:ilvl w:val="1"/>
+          <w:numId w:val="9"/>
+        </w:numPr>
+        <w:rPr>
+          <w:b/>
+          <w:bCs/>
+        </w:rPr>
+      </w:pPr>
+      <w:r>
+        <w:rPr>
+          <w:b/>
+          <w:bCs/>
+        </w:rPr>
+        <w:t xml:space="preserve">pop(): </w:t>
+      </w:r>
+      <w:r>
+        <w:t xml:space="preserve">it </w:t>
+      </w:r>
+      <w:r>
+        <w:t xml:space="preserve">removes the </w:t>
+      </w:r>
+      <w:r>
+        <w:t>element in the speci</w:t>
+      </w:r>
+      <w:r>
+        <w:t>fied index. This method takes one</w:t>
+      </w:r>
+      <w:r>
+        <w:t xml:space="preserve"> parameter index. Index is</w:t>
+      </w:r>
+      <w:r>
+        <w:t xml:space="preserve"> to remove element on list.</w:t>
+      </w:r>
+      <w:r>
+        <w:t xml:space="preserve"> It also modify the original list.</w:t>
+      </w:r>
+    </w:p>
+    <w:p>
+      <w:pPr>
+        <w:pStyle w:val="ListParagraph"/>
+        <w:ind w:left="2520"/>
+      </w:pPr>
+      <w:r>
+        <w:t>Example</w:t>
+      </w:r>
+      <w:r>
+        <w:t xml:space="preserve">: </w:t>
+      </w:r>
+    </w:p>
+    <w:p>
+      <w:pPr>
+        <w:pStyle w:val="ListParagraph"/>
+        <w:ind w:left="2520"/>
+      </w:pPr>
+      <w:r>
+        <w:tab/>
+      </w:r>
+      <w:r>
+        <w:t>Example</w:t>
+      </w:r>
+      <w:r>
+        <w:t>:</w:t>
+      </w:r>
+    </w:p>
+    <w:p>
+      <w:pPr>
+        <w:pStyle w:val="ListParagraph"/>
+        <w:ind w:left="2520"/>
+      </w:pPr>
+      <w:r>
+        <w:tab/>
+        <w:t>List = [4,2,3, 6, 1]</w:t>
+      </w:r>
+    </w:p>
+    <w:p>
+      <w:pPr>
+        <w:pStyle w:val="ListParagraph"/>
+        <w:ind w:left="2520"/>
+      </w:pPr>
+      <w:r>
+        <w:tab/>
+        <w:t>L</w:t>
+      </w:r>
+      <w:r>
+        <w:t>ist.pop</w:t>
+      </w:r>
+      <w:r>
+        <w:t>(</w:t>
+      </w:r>
+      <w:r>
+        <w:t>2) it will remove 3</w:t>
+      </w:r>
+      <w:r>
+        <w:t xml:space="preserve"> from list</w:t>
+      </w:r>
+      <w:r>
+        <w:t xml:space="preserve"> cause it’s index is 2</w:t>
+      </w:r>
+      <w:r>
+        <w:t>.</w:t>
+      </w:r>
+    </w:p>
+    <w:p>
+      <w:pPr>
+        <w:pStyle w:val="ListParagraph"/>
+        <w:ind w:left="2520"/>
+      </w:pPr>
+      <w:r>
+        <w:tab/>
+        <w:t>Print(list)</w:t>
+      </w:r>
+    </w:p>
+    <w:p>
+      <w:pPr>
+        <w:pStyle w:val="ListParagraph"/>
+        <w:numPr>
+          <w:ilvl w:val="1"/>
+          <w:numId w:val="9"/>
+        </w:numPr>
+        <w:rPr>
+          <w:b/>
+          <w:bCs/>
+        </w:rPr>
+      </w:pPr>
+      <w:r>
+        <w:rPr>
+          <w:b/>
+          <w:bCs/>
+        </w:rPr>
+        <w:t>count()</w:t>
+      </w:r>
+      <w:r>
+        <w:rPr>
+          <w:b/>
+          <w:bCs/>
+        </w:rPr>
+        <w:t xml:space="preserve">: </w:t>
+      </w:r>
+      <w:r>
+        <w:t>it return no of</w:t>
+      </w:r>
+      <w:r>
+        <w:t xml:space="preserve"> time</w:t>
+      </w:r>
+      <w:r>
+        <w:t xml:space="preserve"> elements</w:t>
+      </w:r>
+      <w:r>
+        <w:t xml:space="preserve"> occurred</w:t>
+      </w:r>
+      <w:r>
+        <w:t xml:space="preserve"> in the list.</w:t>
+      </w:r>
+    </w:p>
+    <w:p>
+      <w:pPr>
+        <w:pStyle w:val="ListParagraph"/>
+        <w:ind w:left="2520"/>
+      </w:pPr>
+      <w:r>
+        <w:t>Example:</w:t>
+      </w:r>
+    </w:p>
+    <w:p>
+      <w:pPr>
+        <w:pStyle w:val="ListParagraph"/>
+        <w:ind w:left="2520"/>
+      </w:pPr>
+      <w:r>
+        <w:tab/>
+        <w:t xml:space="preserve">List = </w:t>
+      </w:r>
+      <w:r>
+        <w:t>[4,</w:t>
+      </w:r>
+      <w:r>
+        <w:t>2,</w:t>
+      </w:r>
+      <w:r>
+        <w:t>2,3</w:t>
+      </w:r>
+      <w:r>
+        <w:t>,1,6,</w:t>
+      </w:r>
+      <w:r>
+        <w:t>1]</w:t>
+      </w:r>
+    </w:p>
+    <w:p>
+      <w:pPr>
+        <w:pStyle w:val="ListParagraph"/>
+        <w:ind w:left="2520"/>
+      </w:pPr>
+      <w:r>
+        <w:tab/>
+        <w:t xml:space="preserve">Print(List.count()) </w:t>
+      </w:r>
+    </w:p>
+    <w:p>
+      <w:pPr>
+        <w:pStyle w:val="ListParagraph"/>
+        <w:numPr>
+          <w:ilvl w:val="1"/>
+          <w:numId w:val="9"/>
+        </w:numPr>
+        <w:rPr>
+          <w:b/>
+          <w:bCs/>
+        </w:rPr>
+      </w:pPr>
+      <w:r>
+        <w:rPr>
+          <w:b/>
+          <w:bCs/>
+        </w:rPr>
+        <w:t>copy():</w:t>
+      </w:r>
+      <w:r>
+        <w:t xml:space="preserve"> create a shallow copy of original list.</w:t>
+      </w:r>
+    </w:p>
+    <w:p>
+      <w:pPr>
+        <w:pStyle w:val="ListParagraph"/>
+        <w:ind w:left="2520"/>
+      </w:pPr>
+      <w:r>
+        <w:t>Example:</w:t>
+      </w:r>
+    </w:p>
+    <w:p>
+      <w:pPr>
+        <w:pStyle w:val="ListParagraph"/>
+        <w:ind w:left="2520"/>
+      </w:pPr>
+      <w:r>
+        <w:tab/>
+        <w:t xml:space="preserve">List1 = </w:t>
+      </w:r>
+      <w:r>
+        <w:t>[4,2,3, 6, 1]</w:t>
+      </w:r>
+    </w:p>
+    <w:p>
+      <w:pPr>
+        <w:pStyle w:val="ListParagraph"/>
+        <w:ind w:left="2520"/>
+      </w:pPr>
+      <w:r>
+        <w:tab/>
+        <w:t xml:space="preserve">List2 = </w:t>
+      </w:r>
+      <w:r>
+        <w:t>List1</w:t>
+      </w:r>
+      <w:r>
+        <w:t>.</w:t>
+      </w:r>
+      <w:r>
+        <w:t xml:space="preserve">copy() </w:t>
+      </w:r>
+    </w:p>
+    <w:p>
+      <w:pPr>
+        <w:pStyle w:val="ListParagraph"/>
+        <w:numPr>
+          <w:ilvl w:val="1"/>
+          <w:numId w:val="9"/>
+        </w:numPr>
+        <w:rPr>
+          <w:b/>
+          <w:bCs/>
+        </w:rPr>
+      </w:pPr>
+      <w:r>
+        <w:rPr>
+          <w:b/>
+          <w:bCs/>
+        </w:rPr>
+        <w:t xml:space="preserve">clear(): </w:t>
+      </w:r>
+      <w:r>
+        <w:t xml:space="preserve">it remove all </w:t>
+      </w:r>
+      <w:r>
+        <w:t>element from list</w:t>
+      </w:r>
+      <w:r>
+        <w:t xml:space="preserve"> and keeps the list variable</w:t>
+      </w:r>
+      <w:r>
+        <w:t xml:space="preserve">. </w:t>
+      </w:r>
+    </w:p>
+    <w:p>
+      <w:pPr>
+        <w:pStyle w:val="ListParagraph"/>
+        <w:ind w:left="2520"/>
+      </w:pPr>
+      <w:r>
+        <w:t>Example:</w:t>
+      </w:r>
+    </w:p>
+    <w:p>
+      <w:pPr>
+        <w:pStyle w:val="ListParagraph"/>
+        <w:ind w:left="2520"/>
+      </w:pPr>
+      <w:r>
+        <w:tab/>
+        <w:t xml:space="preserve">List = </w:t>
+      </w:r>
+      <w:r>
+        <w:t>[4,2,3, 6, 1]</w:t>
+      </w:r>
+    </w:p>
+    <w:p>
+      <w:pPr>
+        <w:pStyle w:val="ListParagraph"/>
+        <w:ind w:left="2520"/>
+      </w:pPr>
+      <w:r>
+        <w:tab/>
+        <w:t>List.clear();</w:t>
+      </w:r>
+    </w:p>
+    <w:p>
+      <w:pPr>
+        <w:pStyle w:val="ListParagraph"/>
+        <w:ind w:left="2520"/>
+      </w:pPr>
+      <w:r>
+        <w:tab/>
+        <w:t>Print(list)</w:t>
+      </w:r>
+    </w:p>
+    <w:p>
+      <w:pPr>
+        <w:rPr>
+          <w:b/>
+          <w:bCs/>
+        </w:rPr>
+      </w:pPr>
+    </w:p>
+    <w:p>
+      <w:pPr>
+        <w:rPr>
+          <w:b/>
+          <w:bCs/>
+        </w:rPr>
+      </w:pPr>
+    </w:p>
+    <w:p>
+      <w:pPr>
+        <w:rPr>
+          <w:b/>
+          <w:bCs/>
+        </w:rPr>
+      </w:pPr>
+      <w:r>
+        <w:rPr>
+          <w:b/>
+          <w:bCs/>
+        </w:rPr>
+        <w:lastRenderedPageBreak/>
+        <w:t>Tuple in python</w:t>
+      </w:r>
+    </w:p>
+    <w:p>
+      <w:r>
+        <w:t>It’s a built in data type that lets us create immutable sequences of values. Tuples are generally created using parentheses (). And you can also create tuple without parentheses.</w:t>
+      </w:r>
+      <w:r>
+        <w:t xml:space="preserve"> A single-element without comma consider as type of value like int, string, bool, float. But with single value with comma it’s considered as tuple. </w:t>
+      </w:r>
+    </w:p>
+    <w:p>
+      <w:r>
+        <w:t xml:space="preserve">Example: </w:t>
+      </w:r>
+    </w:p>
+    <w:p>
+      <w:r>
+        <w:t xml:space="preserve">Creating tuple </w:t>
+      </w:r>
+    </w:p>
+    <w:p>
+      <w:r>
+        <w:t xml:space="preserve">Number = (1,2,3,4,5,6) – with parentheses. </w:t>
+      </w:r>
+    </w:p>
+    <w:p>
+      <w:r>
+        <w:t>Number = 1,2,3,4,5,6,7 – it possible to create tuple without parentheses.</w:t>
+      </w:r>
+    </w:p>
+    <w:p>
+      <w:r>
+        <w:t xml:space="preserve">Creating tuple with single element </w:t>
+      </w:r>
+    </w:p>
+    <w:p>
+      <w:r>
+        <w:t>Number = (1) – it consider as normal integer variable</w:t>
+      </w:r>
+    </w:p>
+    <w:p>
+      <w:r>
+        <w:t>Number = (1,) – it considered as tuple cause element is followed with comma.</w:t>
+      </w:r>
+    </w:p>
+    <w:p>
+      <w:pPr>
+        <w:rPr>
+          <w:b/>
+          <w:bCs/>
+        </w:rPr>
+      </w:pPr>
+      <w:r>
+        <w:rPr>
+          <w:b/>
+          <w:bCs/>
+        </w:rPr>
+        <w:t>Tuple Methods</w:t>
+      </w:r>
+    </w:p>
+    <w:p>
+      <w:r>
+        <w:t>In Python tuple have only two inbuilt method because tuple is immutable means you cannot add, remove or modify existing tuple. Import is these are not tuple methods, but they are commonly used with the tuples.</w:t>
+      </w:r>
+    </w:p>
+    <w:p>
+      <w:pPr>
+        <w:pStyle w:val="ListParagraph"/>
+        <w:numPr>
+          <w:ilvl w:val="0"/>
+          <w:numId w:val="10"/>
+        </w:numPr>
+        <w:rPr>
+          <w:b/>
+          <w:bCs/>
+        </w:rPr>
+      </w:pPr>
+      <w:r>
+        <w:rPr>
+          <w:b/>
+          <w:bCs/>
+        </w:rPr>
+        <w:t>Index</w:t>
+      </w:r>
+      <w:r>
+        <w:rPr>
+          <w:b/>
+          <w:bCs/>
+        </w:rPr>
+        <w:t xml:space="preserve">: </w:t>
+      </w:r>
+      <w:r>
+        <w:t>returns the index of the first occurrence of a value.</w:t>
+      </w:r>
+      <w:r>
+        <w:t xml:space="preserve"> And it takes one argument </w:t>
+      </w:r>
+    </w:p>
+    <w:p>
+      <w:pPr>
+        <w:pStyle w:val="ListParagraph"/>
+      </w:pPr>
+      <w:r>
+        <w:t>Example:</w:t>
+      </w:r>
+    </w:p>
+    <w:p>
+      <w:pPr>
+        <w:pStyle w:val="ListParagraph"/>
+      </w:pPr>
+      <w:r>
+        <w:tab/>
+        <w:t>Marks = (60,40,50,30,70,60,50,23,45,78,90)</w:t>
+      </w:r>
+    </w:p>
+    <w:p>
+      <w:pPr>
+        <w:pStyle w:val="ListParagraph"/>
+      </w:pPr>
+      <w:r>
+        <w:tab/>
+        <w:t>print(Marks.index(50)) – It will return 2 cause on index 2 value is 50</w:t>
+      </w:r>
+    </w:p>
+    <w:p>
+      <w:pPr>
+        <w:pStyle w:val="ListParagraph"/>
+      </w:pPr>
+      <w:r>
+        <w:tab/>
+        <w:t>print(</w:t>
+      </w:r>
+      <w:r>
+        <w:t>Marks.index(</w:t>
+      </w:r>
+      <w:r>
+        <w:t xml:space="preserve">50, </w:t>
+      </w:r>
+      <w:r>
+        <w:t>2)</w:t>
+      </w:r>
+      <w:r>
+        <w:t xml:space="preserve">) – it will return 6 cause it starting search from index 2 </w:t>
+      </w:r>
+    </w:p>
+    <w:p>
+      <w:pPr>
+        <w:pStyle w:val="ListParagraph"/>
+      </w:pPr>
+    </w:p>
+    <w:p>
+      <w:pPr>
+        <w:pStyle w:val="ListParagraph"/>
+        <w:numPr>
+          <w:ilvl w:val="0"/>
+          <w:numId w:val="10"/>
+        </w:numPr>
+        <w:rPr>
+          <w:b/>
+          <w:bCs/>
+        </w:rPr>
+      </w:pPr>
+      <w:r>
+        <w:rPr>
+          <w:b/>
+          <w:bCs/>
+        </w:rPr>
+        <w:t>count():</w:t>
+      </w:r>
+      <w:r>
+        <w:rPr>
+          <w:b/>
+          <w:bCs/>
+        </w:rPr>
+        <w:t xml:space="preserve"> </w:t>
+      </w:r>
+      <w:r>
+        <w:t>count how many times a particular value is repeated in tuple.</w:t>
+      </w:r>
+    </w:p>
+    <w:p>
+      <w:pPr>
+        <w:pStyle w:val="ListParagraph"/>
+      </w:pPr>
+      <w:r>
+        <w:t>Example:</w:t>
+      </w:r>
+    </w:p>
+    <w:p>
+      <w:pPr>
+        <w:pStyle w:val="ListParagraph"/>
+        <w:ind w:firstLine="720"/>
+      </w:pPr>
+      <w:r>
+        <w:t>Marks = (60,40,50,30,70,60,50,23,45,78,90)</w:t>
+      </w:r>
+    </w:p>
+    <w:p>
+      <w:pPr>
+        <w:pStyle w:val="ListParagraph"/>
+        <w:ind w:firstLine="720"/>
+      </w:pPr>
+      <w:r>
+        <w:t>print(Marks.count(50))</w:t>
+      </w:r>
+    </w:p>
+    <w:p>
       <w:bookmarkStart w:id="0" w:name="_GoBack"/>
       <w:bookmarkEnd w:id="0"/>
-      <w:r>
-        <w:t>)</w:t>
-      </w:r>
-    </w:p>
-    <w:p>
-      <w:pPr>
-        <w:pStyle w:val="ListParagraph"/>
-        <w:ind w:left="1800"/>
+    </w:p>
+    <w:p/>
+    <w:p>
+      <w:pPr>
+        <w:rPr>
+          <w:b/>
+          <w:bCs/>
+        </w:rPr>
       </w:pPr>
     </w:p>
     <w:sectPr>
@@ -3481,7 +4518,7 @@
   <w:abstractNum w:abstractNumId="4" w15:restartNumberingAfterBreak="0">
     <w:nsid w:val="50BE4FB1"/>
     <w:multiLevelType w:val="hybridMultilevel"/>
-    <w:tmpl w:val="92B0E7A8"/>
+    <w:tmpl w:val="FF88888A"/>
     <w:lvl w:ilvl="0" w:tplc="C2FCC120">
       <w:start w:val="1"/>
       <w:numFmt w:val="decimal"/>
@@ -3494,7 +4531,7 @@
         <w:rFonts w:hint="default"/>
       </w:rPr>
     </w:lvl>
-    <w:lvl w:ilvl="1" w:tplc="04090019">
+    <w:lvl w:ilvl="1" w:tplc="7E12DEA0">
       <w:start w:val="1"/>
       <w:numFmt w:val="lowerLetter"/>
       <w:lvlText w:val="%2."/>
@@ -3502,8 +4539,12 @@
       <w:pPr>
         <w:ind w:left="2520" w:hanging="360"/>
       </w:pPr>
-    </w:lvl>
-    <w:lvl w:ilvl="2" w:tplc="0409001B" w:tentative="1">
+      <w:rPr>
+        <w:b/>
+        <w:bCs/>
+      </w:rPr>
+    </w:lvl>
+    <w:lvl w:ilvl="2" w:tplc="0409001B">
       <w:start w:val="1"/>
       <w:numFmt w:val="lowerRoman"/>
       <w:lvlText w:val="%3."/>
@@ -3512,7 +4553,7 @@
         <w:ind w:left="3240" w:hanging="180"/>
       </w:pPr>
     </w:lvl>
-    <w:lvl w:ilvl="3" w:tplc="0409000F" w:tentative="1">
+    <w:lvl w:ilvl="3" w:tplc="0409000F">
       <w:start w:val="1"/>
       <w:numFmt w:val="decimal"/>
       <w:lvlText w:val="%4."/>
@@ -3657,6 +4698,95 @@
     </w:lvl>
   </w:abstractNum>
   <w:abstractNum w:abstractNumId="6" w15:restartNumberingAfterBreak="0">
+    <w:nsid w:val="5E250B85"/>
+    <w:multiLevelType w:val="hybridMultilevel"/>
+    <w:tmpl w:val="537C5430"/>
+    <w:lvl w:ilvl="0" w:tplc="04090011">
+      <w:start w:val="1"/>
+      <w:numFmt w:val="decimal"/>
+      <w:lvlText w:val="%1)"/>
+      <w:lvlJc w:val="left"/>
+      <w:pPr>
+        <w:ind w:left="720" w:hanging="360"/>
+      </w:pPr>
+      <w:rPr>
+        <w:rFonts w:hint="default"/>
+      </w:rPr>
+    </w:lvl>
+    <w:lvl w:ilvl="1" w:tplc="04090019" w:tentative="1">
+      <w:start w:val="1"/>
+      <w:numFmt w:val="lowerLetter"/>
+      <w:lvlText w:val="%2."/>
+      <w:lvlJc w:val="left"/>
+      <w:pPr>
+        <w:ind w:left="1440" w:hanging="360"/>
+      </w:pPr>
+    </w:lvl>
+    <w:lvl w:ilvl="2" w:tplc="0409001B" w:tentative="1">
+      <w:start w:val="1"/>
+      <w:numFmt w:val="lowerRoman"/>
+      <w:lvlText w:val="%3."/>
+      <w:lvlJc w:val="right"/>
+      <w:pPr>
+        <w:ind w:left="2160" w:hanging="180"/>
+      </w:pPr>
+    </w:lvl>
+    <w:lvl w:ilvl="3" w:tplc="0409000F" w:tentative="1">
+      <w:start w:val="1"/>
+      <w:numFmt w:val="decimal"/>
+      <w:lvlText w:val="%4."/>
+      <w:lvlJc w:val="left"/>
+      <w:pPr>
+        <w:ind w:left="2880" w:hanging="360"/>
+      </w:pPr>
+    </w:lvl>
+    <w:lvl w:ilvl="4" w:tplc="04090019" w:tentative="1">
+      <w:start w:val="1"/>
+      <w:numFmt w:val="lowerLetter"/>
+      <w:lvlText w:val="%5."/>
+      <w:lvlJc w:val="left"/>
+      <w:pPr>
+        <w:ind w:left="3600" w:hanging="360"/>
+      </w:pPr>
+    </w:lvl>
+    <w:lvl w:ilvl="5" w:tplc="0409001B" w:tentative="1">
+      <w:start w:val="1"/>
+      <w:numFmt w:val="lowerRoman"/>
+      <w:lvlText w:val="%6."/>
+      <w:lvlJc w:val="right"/>
+      <w:pPr>
+        <w:ind w:left="4320" w:hanging="180"/>
+      </w:pPr>
+    </w:lvl>
+    <w:lvl w:ilvl="6" w:tplc="0409000F" w:tentative="1">
+      <w:start w:val="1"/>
+      <w:numFmt w:val="decimal"/>
+      <w:lvlText w:val="%7."/>
+      <w:lvlJc w:val="left"/>
+      <w:pPr>
+        <w:ind w:left="5040" w:hanging="360"/>
+      </w:pPr>
+    </w:lvl>
+    <w:lvl w:ilvl="7" w:tplc="04090019" w:tentative="1">
+      <w:start w:val="1"/>
+      <w:numFmt w:val="lowerLetter"/>
+      <w:lvlText w:val="%8."/>
+      <w:lvlJc w:val="left"/>
+      <w:pPr>
+        <w:ind w:left="5760" w:hanging="360"/>
+      </w:pPr>
+    </w:lvl>
+    <w:lvl w:ilvl="8" w:tplc="0409001B" w:tentative="1">
+      <w:start w:val="1"/>
+      <w:numFmt w:val="lowerRoman"/>
+      <w:lvlText w:val="%9."/>
+      <w:lvlJc w:val="right"/>
+      <w:pPr>
+        <w:ind w:left="6480" w:hanging="180"/>
+      </w:pPr>
+    </w:lvl>
+  </w:abstractNum>
+  <w:abstractNum w:abstractNumId="7" w15:restartNumberingAfterBreak="0">
     <w:nsid w:val="62F81B48"/>
     <w:multiLevelType w:val="hybridMultilevel"/>
     <w:tmpl w:val="E43C672C"/>
@@ -3746,7 +4876,7 @@
       </w:pPr>
     </w:lvl>
   </w:abstractNum>
-  <w:abstractNum w:abstractNumId="7" w15:restartNumberingAfterBreak="0">
+  <w:abstractNum w:abstractNumId="8" w15:restartNumberingAfterBreak="0">
     <w:nsid w:val="6E4C3096"/>
     <w:multiLevelType w:val="hybridMultilevel"/>
     <w:tmpl w:val="E754352C"/>
@@ -3835,7 +4965,7 @@
       </w:pPr>
     </w:lvl>
   </w:abstractNum>
-  <w:abstractNum w:abstractNumId="8" w15:restartNumberingAfterBreak="0">
+  <w:abstractNum w:abstractNumId="9" w15:restartNumberingAfterBreak="0">
     <w:nsid w:val="7B2D39AC"/>
     <w:multiLevelType w:val="hybridMultilevel"/>
     <w:tmpl w:val="AEAA4742"/>
@@ -3934,22 +5064,25 @@
     <w:abstractNumId w:val="1"/>
   </w:num>
   <w:num w:numId="4">
-    <w:abstractNumId w:val="8"/>
+    <w:abstractNumId w:val="9"/>
   </w:num>
   <w:num w:numId="5">
     <w:abstractNumId w:val="5"/>
   </w:num>
   <w:num w:numId="6">
-    <w:abstractNumId w:val="6"/>
+    <w:abstractNumId w:val="7"/>
   </w:num>
   <w:num w:numId="7">
     <w:abstractNumId w:val="0"/>
   </w:num>
   <w:num w:numId="8">
-    <w:abstractNumId w:val="7"/>
+    <w:abstractNumId w:val="8"/>
   </w:num>
   <w:num w:numId="9">
     <w:abstractNumId w:val="4"/>
+  </w:num>
+  <w:num w:numId="10">
+    <w:abstractNumId w:val="6"/>
   </w:num>
 </w:numbering>
 </file>
@@ -4778,7 +5911,7 @@
 </file>
 
 <file path=customXml/itemProps1.xml><?xml version="1.0" encoding="utf-8"?>
-<ds:datastoreItem xmlns:ds="http://schemas.openxmlformats.org/officeDocument/2006/customXml" ds:itemID="{3217DA53-29E8-4867-9DC3-47525CEB0EFD}">
+<ds:datastoreItem xmlns:ds="http://schemas.openxmlformats.org/officeDocument/2006/customXml" ds:itemID="{7CA271EB-2626-4E0D-9267-6541025999FC}">
   <ds:schemaRefs>
     <ds:schemaRef ds:uri="http://schemas.openxmlformats.org/officeDocument/2006/bibliography"/>
   </ds:schemaRefs>

</xml_diff>